<commit_message>
Added 2.5 Research Gap
</commit_message>
<xml_diff>
--- a/docs/PathGraph2026-2027.docx
+++ b/docs/PathGraph2026-2027.docx
@@ -10599,21 +10599,7 @@
           <w:lang w:eastAsia="en-US"/>
           <w14:ligatures w14:val="standardContextual"/>
         </w:rPr>
-        <w:t xml:space="preserve"> </w:t>
-      </w:r>
-      <w:r>
-        <w:rPr>
-          <w:rFonts w:ascii="Times New Roman" w:eastAsiaTheme="minorEastAsia" w:hAnsiTheme="minorHAnsi" w:cstheme="minorBidi"/>
-          <w:b/>
-          <w:bCs/>
-          <w:color w:val="000000"/>
-          <w:kern w:val="2"/>
-          <w:sz w:val="28"/>
-          <w:szCs w:val="22"/>
-          <w:lang w:eastAsia="en-US"/>
-          <w14:ligatures w14:val="standardContextual"/>
-        </w:rPr>
-        <w:t>Overview</w:t>
+        <w:t xml:space="preserve"> Overview</w:t>
       </w:r>
     </w:p>
     <w:p>
@@ -16827,12 +16813,6 @@
         <w:gridCol w:w="1193"/>
       </w:tblGrid>
       <w:tr>
-        <w:tblPrEx>
-          <w:tblCellMar>
-            <w:top w:w="0" w:type="dxa"/>
-            <w:bottom w:w="0" w:type="dxa"/>
-          </w:tblCellMar>
-        </w:tblPrEx>
         <w:trPr>
           <w:cantSplit/>
           <w:tblHeader/>
@@ -17100,12 +17080,6 @@
         </w:tc>
       </w:tr>
       <w:tr>
-        <w:tblPrEx>
-          <w:tblCellMar>
-            <w:top w:w="0" w:type="dxa"/>
-            <w:bottom w:w="0" w:type="dxa"/>
-          </w:tblCellMar>
-        </w:tblPrEx>
         <w:trPr>
           <w:cantSplit/>
         </w:trPr>
@@ -17383,12 +17357,6 @@
         </w:tc>
       </w:tr>
       <w:tr>
-        <w:tblPrEx>
-          <w:tblCellMar>
-            <w:top w:w="0" w:type="dxa"/>
-            <w:bottom w:w="0" w:type="dxa"/>
-          </w:tblCellMar>
-        </w:tblPrEx>
         <w:trPr>
           <w:cantSplit/>
         </w:trPr>
@@ -17626,12 +17594,6 @@
         </w:tc>
       </w:tr>
       <w:tr>
-        <w:tblPrEx>
-          <w:tblCellMar>
-            <w:top w:w="0" w:type="dxa"/>
-            <w:bottom w:w="0" w:type="dxa"/>
-          </w:tblCellMar>
-        </w:tblPrEx>
         <w:trPr>
           <w:cantSplit/>
         </w:trPr>
@@ -17869,12 +17831,6 @@
         </w:tc>
       </w:tr>
       <w:tr>
-        <w:tblPrEx>
-          <w:tblCellMar>
-            <w:top w:w="0" w:type="dxa"/>
-            <w:bottom w:w="0" w:type="dxa"/>
-          </w:tblCellMar>
-        </w:tblPrEx>
         <w:trPr>
           <w:cantSplit/>
         </w:trPr>
@@ -18113,12 +18069,6 @@
         </w:tc>
       </w:tr>
       <w:tr>
-        <w:tblPrEx>
-          <w:tblCellMar>
-            <w:top w:w="0" w:type="dxa"/>
-            <w:bottom w:w="0" w:type="dxa"/>
-          </w:tblCellMar>
-        </w:tblPrEx>
         <w:trPr>
           <w:cantSplit/>
         </w:trPr>
@@ -18347,12 +18297,6 @@
         </w:tc>
       </w:tr>
       <w:tr>
-        <w:tblPrEx>
-          <w:tblCellMar>
-            <w:top w:w="0" w:type="dxa"/>
-            <w:bottom w:w="0" w:type="dxa"/>
-          </w:tblCellMar>
-        </w:tblPrEx>
         <w:trPr>
           <w:cantSplit/>
         </w:trPr>
@@ -18606,12 +18550,6 @@
         </w:tc>
       </w:tr>
       <w:tr>
-        <w:tblPrEx>
-          <w:tblCellMar>
-            <w:top w:w="0" w:type="dxa"/>
-            <w:bottom w:w="0" w:type="dxa"/>
-          </w:tblCellMar>
-        </w:tblPrEx>
         <w:trPr>
           <w:cantSplit/>
         </w:trPr>
@@ -18646,73 +18584,7 @@
                 <w:sz w:val="28"/>
                 <w:szCs w:val="28"/>
               </w:rPr>
-              <w:t xml:space="preserve">Courses / </w:t>
-            </w:r>
-            <w:r>
-              <w:rPr>
-                <w:rFonts w:ascii="Times New Roman" w:eastAsia="Times New Roman" w:hAnsi="Times New Roman" w:cs="Times New Roman"/>
-                <w:b/>
-                <w:bCs/>
-                <w:color w:val="000000"/>
-                <w:sz w:val="28"/>
-                <w:szCs w:val="28"/>
-              </w:rPr>
-              <w:t>L</w:t>
-            </w:r>
-            <w:r>
-              <w:rPr>
-                <w:rFonts w:ascii="Times New Roman" w:eastAsia="Times New Roman" w:hAnsi="Times New Roman" w:cs="Times New Roman"/>
-                <w:b/>
-                <w:bCs/>
-                <w:color w:val="000000"/>
-                <w:sz w:val="28"/>
-                <w:szCs w:val="28"/>
-              </w:rPr>
-              <w:t xml:space="preserve">essons </w:t>
-            </w:r>
-            <w:r>
-              <w:rPr>
-                <w:rFonts w:ascii="Times New Roman" w:eastAsia="Times New Roman" w:hAnsi="Times New Roman" w:cs="Times New Roman"/>
-                <w:b/>
-                <w:bCs/>
-                <w:color w:val="000000"/>
-                <w:sz w:val="28"/>
-                <w:szCs w:val="28"/>
-              </w:rPr>
-              <w:t>B</w:t>
-            </w:r>
-            <w:r>
-              <w:rPr>
-                <w:rFonts w:ascii="Times New Roman" w:eastAsia="Times New Roman" w:hAnsi="Times New Roman" w:cs="Times New Roman"/>
-                <w:b/>
-                <w:bCs/>
-                <w:color w:val="000000"/>
-                <w:sz w:val="28"/>
-                <w:szCs w:val="28"/>
-              </w:rPr>
-              <w:t xml:space="preserve">uilt into </w:t>
-            </w:r>
-            <w:r>
-              <w:rPr>
-                <w:rFonts w:ascii="Times New Roman" w:eastAsia="Times New Roman" w:hAnsi="Times New Roman" w:cs="Times New Roman"/>
-                <w:b/>
-                <w:bCs/>
-                <w:color w:val="000000"/>
-                <w:sz w:val="28"/>
-                <w:szCs w:val="28"/>
-              </w:rPr>
-              <w:t>P</w:t>
-            </w:r>
-            <w:r>
-              <w:rPr>
-                <w:rFonts w:ascii="Times New Roman" w:eastAsia="Times New Roman" w:hAnsi="Times New Roman" w:cs="Times New Roman"/>
-                <w:b/>
-                <w:bCs/>
-                <w:color w:val="000000"/>
-                <w:sz w:val="28"/>
-                <w:szCs w:val="28"/>
-              </w:rPr>
-              <w:t>latform</w:t>
+              <w:t>Courses / Lessons Built into Platform</w:t>
             </w:r>
           </w:p>
         </w:tc>
@@ -18916,12 +18788,6 @@
         </w:tc>
       </w:tr>
       <w:tr>
-        <w:tblPrEx>
-          <w:tblCellMar>
-            <w:top w:w="0" w:type="dxa"/>
-            <w:bottom w:w="0" w:type="dxa"/>
-          </w:tblCellMar>
-        </w:tblPrEx>
         <w:trPr>
           <w:cantSplit/>
         </w:trPr>
@@ -19175,12 +19041,6 @@
         </w:tc>
       </w:tr>
       <w:tr>
-        <w:tblPrEx>
-          <w:tblCellMar>
-            <w:top w:w="0" w:type="dxa"/>
-            <w:bottom w:w="0" w:type="dxa"/>
-          </w:tblCellMar>
-        </w:tblPrEx>
         <w:trPr>
           <w:cantSplit/>
         </w:trPr>
@@ -19424,12 +19284,6 @@
         </w:tc>
       </w:tr>
       <w:tr>
-        <w:tblPrEx>
-          <w:tblCellMar>
-            <w:top w:w="0" w:type="dxa"/>
-            <w:bottom w:w="0" w:type="dxa"/>
-          </w:tblCellMar>
-        </w:tblPrEx>
         <w:trPr>
           <w:cantSplit/>
         </w:trPr>
@@ -19773,10 +19627,67 @@
           <w:kern w:val="2"/>
           <w:sz w:val="28"/>
           <w:szCs w:val="22"/>
-          <w:lang w:eastAsia="en-US"/>
-          <w14:ligatures w14:val="standardContextual"/>
-        </w:rPr>
-      </w:pPr>
+          <w:lang w:val="en-US" w:eastAsia="en-US"/>
+          <w14:ligatures w14:val="standardContextual"/>
+        </w:rPr>
+      </w:pPr>
+      <w:r>
+        <w:rPr>
+          <w:rFonts w:ascii="Times New Roman" w:eastAsiaTheme="minorEastAsia" w:hAnsiTheme="minorHAnsi" w:cstheme="minorBidi"/>
+          <w:b/>
+          <w:bCs/>
+          <w:color w:val="000000"/>
+          <w:kern w:val="2"/>
+          <w:sz w:val="28"/>
+          <w:szCs w:val="22"/>
+          <w:lang w:eastAsia="en-US"/>
+          <w14:ligatures w14:val="standardContextual"/>
+        </w:rPr>
+        <w:t>2.5</w:t>
+      </w:r>
+      <w:r>
+        <w:rPr>
+          <w:rFonts w:ascii="Times New Roman" w:eastAsiaTheme="minorEastAsia" w:hAnsiTheme="minorHAnsi" w:cstheme="minorBidi" w:hint="cs"/>
+          <w:b/>
+          <w:bCs/>
+          <w:color w:val="000000"/>
+          <w:kern w:val="2"/>
+          <w:sz w:val="28"/>
+          <w:szCs w:val="22"/>
+          <w:rtl/>
+          <w:lang w:eastAsia="en-US"/>
+          <w14:ligatures w14:val="standardContextual"/>
+        </w:rPr>
+        <w:t xml:space="preserve">  </w:t>
+      </w:r>
+      <w:r>
+        <w:rPr>
+          <w:rFonts w:ascii="Times New Roman" w:eastAsiaTheme="minorEastAsia" w:hAnsiTheme="minorHAnsi" w:cstheme="minorBidi"/>
+          <w:b/>
+          <w:bCs/>
+          <w:color w:val="000000"/>
+          <w:kern w:val="2"/>
+          <w:sz w:val="28"/>
+          <w:szCs w:val="22"/>
+          <w:lang w:val="en-US" w:eastAsia="en-US"/>
+          <w14:ligatures w14:val="standardContextual"/>
+        </w:rPr>
+        <w:t xml:space="preserve"> </w:t>
+      </w:r>
+      <w:r>
+        <w:rPr>
+          <w:rFonts w:ascii="Times New Roman" w:eastAsiaTheme="minorEastAsia" w:hAnsiTheme="minorHAnsi" w:cstheme="minorBidi"/>
+          <w:b/>
+          <w:bCs/>
+          <w:color w:val="000000"/>
+          <w:kern w:val="2"/>
+          <w:sz w:val="28"/>
+          <w:szCs w:val="22"/>
+          <w:lang w:val="en-US" w:eastAsia="en-US"/>
+          <w14:ligatures w14:val="standardContextual"/>
+        </w:rPr>
+        <w:t>Research Gap</w:t>
+      </w:r>
     </w:p>
     <w:p>
       <w:pPr>
@@ -19786,17 +19697,25 @@
         <w:spacing w:before="171" w:line="311" w:lineRule="exact"/>
         <w:jc w:val="both"/>
         <w:rPr>
-          <w:rFonts w:ascii="Times New Roman" w:eastAsiaTheme="minorEastAsia" w:hAnsiTheme="minorHAnsi" w:cstheme="minorBidi"/>
-          <w:b/>
-          <w:bCs/>
-          <w:color w:val="000000"/>
-          <w:kern w:val="2"/>
-          <w:sz w:val="28"/>
-          <w:szCs w:val="22"/>
-          <w:lang w:eastAsia="en-US"/>
-          <w14:ligatures w14:val="standardContextual"/>
-        </w:rPr>
-      </w:pPr>
+          <w:rFonts w:asciiTheme="majorBidi" w:eastAsiaTheme="minorHAnsi" w:hAnsiTheme="majorBidi" w:cstheme="majorBidi"/>
+          <w:kern w:val="2"/>
+          <w:sz w:val="28"/>
+          <w:szCs w:val="28"/>
+          <w:lang w:eastAsia="en-US"/>
+          <w14:ligatures w14:val="standardContextual"/>
+        </w:rPr>
+      </w:pPr>
+      <w:r>
+        <w:rPr>
+          <w:rFonts w:asciiTheme="majorBidi" w:eastAsiaTheme="minorHAnsi" w:hAnsiTheme="majorBidi" w:cstheme="majorBidi"/>
+          <w:kern w:val="2"/>
+          <w:sz w:val="28"/>
+          <w:szCs w:val="28"/>
+          <w:lang w:eastAsia="en-US"/>
+          <w14:ligatures w14:val="standardContextual"/>
+        </w:rPr>
+        <w:t>Despite the availability of various learning path recommendation platforms (such as roadmap.sh, Learn Anything, Mochivia, DevRoadmaps, and DeveloperPaths), a critical gap remains in the level of personalization they offer. The comparative analysis reveals that these existing systems predominantly provide static, predefined roadmaps based on the chosen career role (e.g., Backend Developer). They assume a "one-size-fits-all" approach, offering the exact same sequence of topics to every learner regardless of their prior knowledge.</w:t>
+      </w:r>
     </w:p>
     <w:p>
       <w:pPr>
@@ -19806,17 +19725,25 @@
         <w:spacing w:before="171" w:line="311" w:lineRule="exact"/>
         <w:jc w:val="both"/>
         <w:rPr>
-          <w:rFonts w:ascii="Times New Roman" w:eastAsiaTheme="minorEastAsia" w:hAnsiTheme="minorHAnsi" w:cstheme="minorBidi"/>
-          <w:b/>
-          <w:bCs/>
-          <w:color w:val="000000"/>
-          <w:kern w:val="2"/>
-          <w:sz w:val="28"/>
-          <w:szCs w:val="22"/>
-          <w:lang w:eastAsia="en-US"/>
-          <w14:ligatures w14:val="standardContextual"/>
-        </w:rPr>
-      </w:pPr>
+          <w:rFonts w:asciiTheme="majorBidi" w:eastAsiaTheme="minorHAnsi" w:hAnsiTheme="majorBidi" w:cstheme="majorBidi"/>
+          <w:kern w:val="2"/>
+          <w:sz w:val="28"/>
+          <w:szCs w:val="28"/>
+          <w:lang w:eastAsia="en-US"/>
+          <w14:ligatures w14:val="standardContextual"/>
+        </w:rPr>
+      </w:pPr>
+      <w:r>
+        <w:rPr>
+          <w:rFonts w:asciiTheme="majorBidi" w:eastAsiaTheme="minorHAnsi" w:hAnsiTheme="majorBidi" w:cstheme="majorBidi"/>
+          <w:kern w:val="2"/>
+          <w:sz w:val="28"/>
+          <w:szCs w:val="28"/>
+          <w:lang w:eastAsia="en-US"/>
+          <w14:ligatures w14:val="standardContextual"/>
+        </w:rPr>
+        <w:t>This generalized approach creates inefficiency. Learners who already possess certain skills within the roadmap must manually identify and skip redundant topics, leading to a waste of time and potential confusion. The core limitation across all five reviewed platforms is the absence of an automated mechanism to dynamically tailor the learning sequence based on an individual's current competency state.</w:t>
+      </w:r>
     </w:p>
     <w:p>
       <w:pPr>
@@ -19826,17 +19753,36 @@
         <w:spacing w:before="171" w:line="311" w:lineRule="exact"/>
         <w:jc w:val="both"/>
         <w:rPr>
-          <w:rFonts w:ascii="Times New Roman" w:eastAsiaTheme="minorEastAsia" w:hAnsiTheme="minorHAnsi" w:cstheme="minorBidi"/>
-          <w:b/>
-          <w:bCs/>
-          <w:color w:val="000000"/>
-          <w:kern w:val="2"/>
-          <w:sz w:val="28"/>
-          <w:szCs w:val="22"/>
-          <w:lang w:eastAsia="en-US"/>
-          <w14:ligatures w14:val="standardContextual"/>
-        </w:rPr>
-      </w:pPr>
+          <w:rFonts w:asciiTheme="majorBidi" w:eastAsiaTheme="minorHAnsi" w:hAnsiTheme="majorBidi" w:cstheme="majorBidi"/>
+          <w:kern w:val="2"/>
+          <w:sz w:val="28"/>
+          <w:szCs w:val="28"/>
+          <w:lang w:eastAsia="en-US"/>
+          <w14:ligatures w14:val="standardContextual"/>
+        </w:rPr>
+      </w:pPr>
+      <w:r>
+        <w:rPr>
+          <w:rFonts w:asciiTheme="majorBidi" w:eastAsiaTheme="minorHAnsi" w:hAnsiTheme="majorBidi" w:cstheme="majorBidi"/>
+          <w:kern w:val="2"/>
+          <w:sz w:val="28"/>
+          <w:szCs w:val="28"/>
+          <w:lang w:eastAsia="en-US"/>
+          <w14:ligatures w14:val="standardContextual"/>
+        </w:rPr>
+        <w:t>PathGraph addresses this specific methodological gap. Unlike existing solutions that supply a static map, PathGraph dynamically generates a personalized roadmap by first identifying what the user already knows (through skill declaration, concept-level assessment, and CV analysis). It then calculates the precise "Competency Gap" and constructs a logically sequenced, prerequisite-aware path that includes only the skills the learner actually needs to acquire to reach their target career</w:t>
+      </w:r>
+      <w:r>
+        <w:rPr>
+          <w:rFonts w:asciiTheme="majorBidi" w:eastAsiaTheme="minorHAnsi" w:hAnsiTheme="majorBidi" w:cstheme="majorBidi"/>
+          <w:kern w:val="2"/>
+          <w:sz w:val="28"/>
+          <w:szCs w:val="28"/>
+          <w:lang w:eastAsia="en-US"/>
+          <w14:ligatures w14:val="standardContextual"/>
+        </w:rPr>
+        <w:t>.</w:t>
+      </w:r>
     </w:p>
     <w:p>
       <w:pPr>
@@ -19884,7 +19830,7 @@
         <w:autoSpaceDE w:val="0"/>
         <w:autoSpaceDN w:val="0"/>
         <w:spacing w:before="171" w:line="311" w:lineRule="exact"/>
-        <w:jc w:val="center"/>
+        <w:jc w:val="both"/>
         <w:rPr>
           <w:rFonts w:ascii="Times New Roman" w:eastAsiaTheme="minorEastAsia" w:hAnsiTheme="minorHAnsi" w:cstheme="minorBidi"/>
           <w:b/>
@@ -19897,20 +19843,6 @@
           <w14:ligatures w14:val="standardContextual"/>
         </w:rPr>
       </w:pPr>
-      <w:r>
-        <w:rPr>
-          <w:rFonts w:ascii="Times New Roman" w:eastAsiaTheme="minorEastAsia" w:hAnsiTheme="minorHAnsi" w:cstheme="minorBidi"/>
-          <w:b/>
-          <w:bCs/>
-          <w:color w:val="000000"/>
-          <w:kern w:val="2"/>
-          <w:sz w:val="28"/>
-          <w:szCs w:val="22"/>
-          <w:lang w:eastAsia="en-US"/>
-          <w14:ligatures w14:val="standardContextual"/>
-        </w:rPr>
-        <w:t>References</w:t>
-      </w:r>
     </w:p>
     <w:p>
       <w:pPr>
@@ -19921,98 +19853,16 @@
         <w:jc w:val="both"/>
         <w:rPr>
           <w:rFonts w:ascii="Times New Roman" w:eastAsiaTheme="minorEastAsia" w:hAnsiTheme="minorHAnsi" w:cstheme="minorBidi"/>
-          <w:color w:val="000000"/>
-          <w:kern w:val="2"/>
-          <w:sz w:val="28"/>
-          <w:szCs w:val="28"/>
-          <w:lang w:eastAsia="en-US"/>
-          <w14:ligatures w14:val="standardContextual"/>
-        </w:rPr>
-      </w:pPr>
-      <w:r>
-        <w:rPr>
-          <w:rFonts w:ascii="Times New Roman" w:eastAsiaTheme="minorEastAsia" w:hAnsiTheme="minorHAnsi" w:cstheme="minorBidi"/>
-          <w:color w:val="000000"/>
-          <w:kern w:val="2"/>
-          <w:sz w:val="28"/>
-          <w:szCs w:val="28"/>
-          <w:lang w:eastAsia="en-US"/>
-          <w14:ligatures w14:val="standardContextual"/>
-        </w:rPr>
-        <w:t xml:space="preserve">[1] J. Tenenberg and D. Chinn, </w:t>
-      </w:r>
-      <w:r>
-        <w:rPr>
-          <w:rFonts w:ascii="Times New Roman" w:eastAsiaTheme="minorEastAsia" w:hAnsiTheme="minorHAnsi" w:cstheme="minorBidi"/>
-          <w:color w:val="000000"/>
-          <w:kern w:val="2"/>
-          <w:sz w:val="28"/>
-          <w:szCs w:val="28"/>
-          <w:lang w:eastAsia="en-US"/>
-          <w14:ligatures w14:val="standardContextual"/>
-        </w:rPr>
-        <w:t>“</w:t>
-      </w:r>
-      <w:r>
-        <w:rPr>
-          <w:rFonts w:ascii="Times New Roman" w:eastAsiaTheme="minorEastAsia" w:hAnsiTheme="minorHAnsi" w:cstheme="minorBidi"/>
-          <w:color w:val="000000"/>
-          <w:kern w:val="2"/>
-          <w:sz w:val="28"/>
-          <w:szCs w:val="28"/>
-          <w:lang w:eastAsia="en-US"/>
-          <w14:ligatures w14:val="standardContextual"/>
-        </w:rPr>
-        <w:t>Epistemic practices in conceptions of computer science,</w:t>
-      </w:r>
-      <w:r>
-        <w:rPr>
-          <w:rFonts w:ascii="Times New Roman" w:eastAsiaTheme="minorEastAsia" w:hAnsiTheme="minorHAnsi" w:cstheme="minorBidi"/>
-          <w:color w:val="000000"/>
-          <w:kern w:val="2"/>
-          <w:sz w:val="28"/>
-          <w:szCs w:val="28"/>
-          <w:lang w:eastAsia="en-US"/>
-          <w14:ligatures w14:val="standardContextual"/>
-        </w:rPr>
-        <w:t>”</w:t>
-      </w:r>
-      <w:r>
-        <w:rPr>
-          <w:rFonts w:ascii="Times New Roman" w:eastAsiaTheme="minorEastAsia" w:hAnsiTheme="minorHAnsi" w:cstheme="minorBidi"/>
-          <w:color w:val="000000"/>
-          <w:kern w:val="2"/>
-          <w:sz w:val="28"/>
-          <w:szCs w:val="28"/>
-          <w:lang w:eastAsia="en-US"/>
-          <w14:ligatures w14:val="standardContextual"/>
-        </w:rPr>
-        <w:t xml:space="preserve"> Comput. Sci. Educ., vol. 35, no. 1, pp. 190</w:t>
-      </w:r>
-      <w:r>
-        <w:rPr>
-          <w:rFonts w:ascii="Times New Roman" w:eastAsiaTheme="minorEastAsia" w:hAnsiTheme="minorHAnsi" w:cstheme="minorBidi"/>
-          <w:color w:val="000000"/>
-          <w:kern w:val="2"/>
-          <w:sz w:val="28"/>
-          <w:szCs w:val="28"/>
-          <w:lang w:eastAsia="en-US"/>
-          <w14:ligatures w14:val="standardContextual"/>
-        </w:rPr>
-        <w:t>–</w:t>
-      </w:r>
-      <w:r>
-        <w:rPr>
-          <w:rFonts w:ascii="Times New Roman" w:eastAsiaTheme="minorEastAsia" w:hAnsiTheme="minorHAnsi" w:cstheme="minorBidi"/>
-          <w:color w:val="000000"/>
-          <w:kern w:val="2"/>
-          <w:sz w:val="28"/>
-          <w:szCs w:val="28"/>
-          <w:lang w:eastAsia="en-US"/>
-          <w14:ligatures w14:val="standardContextual"/>
-        </w:rPr>
-        <w:t>211, 2025, doi: 10.1080/08993408.2024.2381398.</w:t>
-      </w:r>
+          <w:b/>
+          <w:bCs/>
+          <w:color w:val="000000"/>
+          <w:kern w:val="2"/>
+          <w:sz w:val="28"/>
+          <w:szCs w:val="22"/>
+          <w:lang w:eastAsia="en-US"/>
+          <w14:ligatures w14:val="standardContextual"/>
+        </w:rPr>
+      </w:pPr>
     </w:p>
     <w:p>
       <w:pPr>
@@ -20023,122 +19873,16 @@
         <w:jc w:val="both"/>
         <w:rPr>
           <w:rFonts w:ascii="Times New Roman" w:eastAsiaTheme="minorEastAsia" w:hAnsiTheme="minorHAnsi" w:cstheme="minorBidi"/>
-          <w:color w:val="000000"/>
-          <w:kern w:val="2"/>
-          <w:sz w:val="28"/>
-          <w:szCs w:val="28"/>
-          <w:lang w:eastAsia="en-US"/>
-          <w14:ligatures w14:val="standardContextual"/>
-        </w:rPr>
-      </w:pPr>
-      <w:r>
-        <w:rPr>
-          <w:rFonts w:ascii="Times New Roman" w:eastAsiaTheme="minorEastAsia" w:hAnsiTheme="minorHAnsi" w:cstheme="minorBidi"/>
-          <w:color w:val="000000"/>
-          <w:kern w:val="2"/>
-          <w:sz w:val="28"/>
-          <w:szCs w:val="28"/>
-          <w:lang w:eastAsia="en-US"/>
-          <w14:ligatures w14:val="standardContextual"/>
-        </w:rPr>
-        <w:t xml:space="preserve">[2] K. Dzialets, A. Makeeva, I. Vlasov, A. Potriasaeva, A. Rostovskii, Y. Golubev, and A. Birillo, </w:t>
-      </w:r>
-      <w:r>
-        <w:rPr>
-          <w:rFonts w:ascii="Times New Roman" w:eastAsiaTheme="minorEastAsia" w:hAnsiTheme="minorHAnsi" w:cstheme="minorBidi"/>
-          <w:color w:val="000000"/>
-          <w:kern w:val="2"/>
-          <w:sz w:val="28"/>
-          <w:szCs w:val="28"/>
-          <w:lang w:eastAsia="en-US"/>
-          <w14:ligatures w14:val="standardContextual"/>
-        </w:rPr>
-        <w:t>“</w:t>
-      </w:r>
-      <w:r>
-        <w:rPr>
-          <w:rFonts w:ascii="Times New Roman" w:eastAsiaTheme="minorEastAsia" w:hAnsiTheme="minorHAnsi" w:cstheme="minorBidi"/>
-          <w:color w:val="000000"/>
-          <w:kern w:val="2"/>
-          <w:sz w:val="28"/>
-          <w:szCs w:val="28"/>
-          <w:lang w:eastAsia="en-US"/>
-          <w14:ligatures w14:val="standardContextual"/>
-        </w:rPr>
-        <w:t>Everything you need to know about CS education: Open results from a survey of more than 18,000 participants,</w:t>
-      </w:r>
-      <w:r>
-        <w:rPr>
-          <w:rFonts w:ascii="Times New Roman" w:eastAsiaTheme="minorEastAsia" w:hAnsiTheme="minorHAnsi" w:cstheme="minorBidi"/>
-          <w:color w:val="000000"/>
-          <w:kern w:val="2"/>
-          <w:sz w:val="28"/>
-          <w:szCs w:val="28"/>
-          <w:lang w:eastAsia="en-US"/>
-          <w14:ligatures w14:val="standardContextual"/>
-        </w:rPr>
-        <w:t>”</w:t>
-      </w:r>
-      <w:r>
-        <w:rPr>
-          <w:rFonts w:ascii="Times New Roman" w:eastAsiaTheme="minorEastAsia" w:hAnsiTheme="minorHAnsi" w:cstheme="minorBidi"/>
-          <w:color w:val="000000"/>
-          <w:kern w:val="2"/>
-          <w:sz w:val="28"/>
-          <w:szCs w:val="28"/>
-          <w:lang w:eastAsia="en-US"/>
-          <w14:ligatures w14:val="standardContextual"/>
-        </w:rPr>
-        <w:t xml:space="preserve"> in Proc. ACM Global Comput. Educ. Conf. (CompEd </w:t>
-      </w:r>
-      <w:r>
-        <w:rPr>
-          <w:rFonts w:ascii="Times New Roman" w:eastAsiaTheme="minorEastAsia" w:hAnsiTheme="minorHAnsi" w:cstheme="minorBidi"/>
-          <w:color w:val="000000"/>
-          <w:kern w:val="2"/>
-          <w:sz w:val="28"/>
-          <w:szCs w:val="28"/>
-          <w:lang w:eastAsia="en-US"/>
-          <w14:ligatures w14:val="standardContextual"/>
-        </w:rPr>
-        <w:t>’</w:t>
-      </w:r>
-      <w:r>
-        <w:rPr>
-          <w:rFonts w:ascii="Times New Roman" w:eastAsiaTheme="minorEastAsia" w:hAnsiTheme="minorHAnsi" w:cstheme="minorBidi"/>
-          <w:color w:val="000000"/>
-          <w:kern w:val="2"/>
-          <w:sz w:val="28"/>
-          <w:szCs w:val="28"/>
-          <w:lang w:eastAsia="en-US"/>
-          <w14:ligatures w14:val="standardContextual"/>
-        </w:rPr>
-        <w:t>25), Gaborone, Botswana, 2025, pp. 50</w:t>
-      </w:r>
-      <w:r>
-        <w:rPr>
-          <w:rFonts w:ascii="Times New Roman" w:eastAsiaTheme="minorEastAsia" w:hAnsiTheme="minorHAnsi" w:cstheme="minorBidi"/>
-          <w:color w:val="000000"/>
-          <w:kern w:val="2"/>
-          <w:sz w:val="28"/>
-          <w:szCs w:val="28"/>
-          <w:lang w:eastAsia="en-US"/>
-          <w14:ligatures w14:val="standardContextual"/>
-        </w:rPr>
-        <w:t>–</w:t>
-      </w:r>
-      <w:r>
-        <w:rPr>
-          <w:rFonts w:ascii="Times New Roman" w:eastAsiaTheme="minorEastAsia" w:hAnsiTheme="minorHAnsi" w:cstheme="minorBidi"/>
-          <w:color w:val="000000"/>
-          <w:kern w:val="2"/>
-          <w:sz w:val="28"/>
-          <w:szCs w:val="28"/>
-          <w:lang w:eastAsia="en-US"/>
-          <w14:ligatures w14:val="standardContextual"/>
-        </w:rPr>
-        <w:t>56, doi: 10.1145/3736181.3747133.</w:t>
-      </w:r>
+          <w:b/>
+          <w:bCs/>
+          <w:color w:val="000000"/>
+          <w:kern w:val="2"/>
+          <w:sz w:val="28"/>
+          <w:szCs w:val="22"/>
+          <w:lang w:eastAsia="en-US"/>
+          <w14:ligatures w14:val="standardContextual"/>
+        </w:rPr>
+      </w:pPr>
     </w:p>
     <w:p>
       <w:pPr>
@@ -20149,241 +19893,49 @@
         <w:jc w:val="both"/>
         <w:rPr>
           <w:rFonts w:ascii="Times New Roman" w:eastAsiaTheme="minorEastAsia" w:hAnsiTheme="minorHAnsi" w:cstheme="minorBidi"/>
-          <w:color w:val="000000"/>
-          <w:kern w:val="2"/>
-          <w:sz w:val="28"/>
-          <w:szCs w:val="28"/>
-          <w:lang w:eastAsia="en-US"/>
-          <w14:ligatures w14:val="standardContextual"/>
-        </w:rPr>
-      </w:pPr>
-      <w:r>
-        <w:rPr>
-          <w:rFonts w:ascii="Times New Roman" w:eastAsiaTheme="minorEastAsia" w:hAnsiTheme="minorHAnsi" w:cstheme="minorBidi"/>
-          <w:color w:val="000000"/>
-          <w:kern w:val="2"/>
-          <w:sz w:val="28"/>
-          <w:szCs w:val="28"/>
-          <w:lang w:eastAsia="en-US"/>
-          <w14:ligatures w14:val="standardContextual"/>
-        </w:rPr>
-        <w:t>[3] R. Tak</w:t>
-      </w:r>
-      <w:r>
-        <w:rPr>
-          <w:rFonts w:ascii="Times New Roman" w:eastAsiaTheme="minorEastAsia" w:hAnsiTheme="minorHAnsi" w:cstheme="minorBidi"/>
-          <w:color w:val="000000"/>
-          <w:kern w:val="2"/>
-          <w:sz w:val="28"/>
-          <w:szCs w:val="28"/>
-          <w:lang w:eastAsia="en-US"/>
-          <w14:ligatures w14:val="standardContextual"/>
-        </w:rPr>
-        <w:t>á</w:t>
-      </w:r>
-      <w:r>
-        <w:rPr>
-          <w:rFonts w:ascii="Times New Roman" w:eastAsiaTheme="minorEastAsia" w:hAnsiTheme="minorHAnsi" w:cstheme="minorBidi"/>
-          <w:color w:val="000000"/>
-          <w:kern w:val="2"/>
-          <w:sz w:val="28"/>
-          <w:szCs w:val="28"/>
-          <w:lang w:eastAsia="en-US"/>
-          <w14:ligatures w14:val="standardContextual"/>
-        </w:rPr>
-        <w:t>cs, J. T. K</w:t>
-      </w:r>
-      <w:r>
-        <w:rPr>
-          <w:rFonts w:ascii="Times New Roman" w:eastAsiaTheme="minorEastAsia" w:hAnsiTheme="minorHAnsi" w:cstheme="minorBidi"/>
-          <w:color w:val="000000"/>
-          <w:kern w:val="2"/>
-          <w:sz w:val="28"/>
-          <w:szCs w:val="28"/>
-          <w:lang w:eastAsia="en-US"/>
-          <w14:ligatures w14:val="standardContextual"/>
-        </w:rPr>
-        <w:t>á</w:t>
-      </w:r>
-      <w:r>
-        <w:rPr>
-          <w:rFonts w:ascii="Times New Roman" w:eastAsiaTheme="minorEastAsia" w:hAnsiTheme="minorHAnsi" w:cstheme="minorBidi"/>
-          <w:color w:val="000000"/>
-          <w:kern w:val="2"/>
-          <w:sz w:val="28"/>
-          <w:szCs w:val="28"/>
-          <w:lang w:eastAsia="en-US"/>
-          <w14:ligatures w14:val="standardContextual"/>
-        </w:rPr>
-        <w:t>r</w:t>
-      </w:r>
-      <w:r>
-        <w:rPr>
-          <w:rFonts w:ascii="Times New Roman" w:eastAsiaTheme="minorEastAsia" w:hAnsiTheme="minorHAnsi" w:cstheme="minorBidi"/>
-          <w:color w:val="000000"/>
-          <w:kern w:val="2"/>
-          <w:sz w:val="28"/>
-          <w:szCs w:val="28"/>
-          <w:lang w:eastAsia="en-US"/>
-          <w14:ligatures w14:val="standardContextual"/>
-        </w:rPr>
-        <w:t>á</w:t>
-      </w:r>
-      <w:r>
-        <w:rPr>
-          <w:rFonts w:ascii="Times New Roman" w:eastAsiaTheme="minorEastAsia" w:hAnsiTheme="minorHAnsi" w:cstheme="minorBidi"/>
-          <w:color w:val="000000"/>
-          <w:kern w:val="2"/>
-          <w:sz w:val="28"/>
-          <w:szCs w:val="28"/>
-          <w:lang w:eastAsia="en-US"/>
-          <w14:ligatures w14:val="standardContextual"/>
-        </w:rPr>
-        <w:t>sz, S. Tak</w:t>
-      </w:r>
-      <w:r>
-        <w:rPr>
-          <w:rFonts w:ascii="Times New Roman" w:eastAsiaTheme="minorEastAsia" w:hAnsiTheme="minorHAnsi" w:cstheme="minorBidi"/>
-          <w:color w:val="000000"/>
-          <w:kern w:val="2"/>
-          <w:sz w:val="28"/>
-          <w:szCs w:val="28"/>
-          <w:lang w:eastAsia="en-US"/>
-          <w14:ligatures w14:val="standardContextual"/>
-        </w:rPr>
-        <w:t>á</w:t>
-      </w:r>
-      <w:r>
-        <w:rPr>
-          <w:rFonts w:ascii="Times New Roman" w:eastAsiaTheme="minorEastAsia" w:hAnsiTheme="minorHAnsi" w:cstheme="minorBidi"/>
-          <w:color w:val="000000"/>
-          <w:kern w:val="2"/>
-          <w:sz w:val="28"/>
-          <w:szCs w:val="28"/>
-          <w:lang w:eastAsia="en-US"/>
-          <w14:ligatures w14:val="standardContextual"/>
-        </w:rPr>
-        <w:t>cs, Z. Horv</w:t>
-      </w:r>
-      <w:r>
-        <w:rPr>
-          <w:rFonts w:ascii="Times New Roman" w:eastAsiaTheme="minorEastAsia" w:hAnsiTheme="minorHAnsi" w:cstheme="minorBidi"/>
-          <w:color w:val="000000"/>
-          <w:kern w:val="2"/>
-          <w:sz w:val="28"/>
-          <w:szCs w:val="28"/>
-          <w:lang w:eastAsia="en-US"/>
-          <w14:ligatures w14:val="standardContextual"/>
-        </w:rPr>
-        <w:t>á</w:t>
-      </w:r>
-      <w:r>
-        <w:rPr>
-          <w:rFonts w:ascii="Times New Roman" w:eastAsiaTheme="minorEastAsia" w:hAnsiTheme="minorHAnsi" w:cstheme="minorBidi"/>
-          <w:color w:val="000000"/>
-          <w:kern w:val="2"/>
-          <w:sz w:val="28"/>
-          <w:szCs w:val="28"/>
-          <w:lang w:eastAsia="en-US"/>
-          <w14:ligatures w14:val="standardContextual"/>
-        </w:rPr>
-        <w:t>th, and A. Ol</w:t>
-      </w:r>
-      <w:r>
-        <w:rPr>
-          <w:rFonts w:ascii="Times New Roman" w:eastAsiaTheme="minorEastAsia" w:hAnsiTheme="minorHAnsi" w:cstheme="minorBidi"/>
-          <w:color w:val="000000"/>
-          <w:kern w:val="2"/>
-          <w:sz w:val="28"/>
-          <w:szCs w:val="28"/>
-          <w:lang w:eastAsia="en-US"/>
-          <w14:ligatures w14:val="standardContextual"/>
-        </w:rPr>
-        <w:t>á</w:t>
-      </w:r>
-      <w:r>
-        <w:rPr>
-          <w:rFonts w:ascii="Times New Roman" w:eastAsiaTheme="minorEastAsia" w:hAnsiTheme="minorHAnsi" w:cstheme="minorBidi"/>
-          <w:color w:val="000000"/>
-          <w:kern w:val="2"/>
-          <w:sz w:val="28"/>
-          <w:szCs w:val="28"/>
-          <w:lang w:eastAsia="en-US"/>
-          <w14:ligatures w14:val="standardContextual"/>
-        </w:rPr>
-        <w:t xml:space="preserve">h, </w:t>
-      </w:r>
-      <w:r>
-        <w:rPr>
-          <w:rFonts w:ascii="Times New Roman" w:eastAsiaTheme="minorEastAsia" w:hAnsiTheme="minorHAnsi" w:cstheme="minorBidi"/>
-          <w:color w:val="000000"/>
-          <w:kern w:val="2"/>
-          <w:sz w:val="28"/>
-          <w:szCs w:val="28"/>
-          <w:lang w:eastAsia="en-US"/>
-          <w14:ligatures w14:val="standardContextual"/>
-        </w:rPr>
-        <w:t>“</w:t>
-      </w:r>
-      <w:r>
-        <w:rPr>
-          <w:rFonts w:ascii="Times New Roman" w:eastAsiaTheme="minorEastAsia" w:hAnsiTheme="minorHAnsi" w:cstheme="minorBidi"/>
-          <w:color w:val="000000"/>
-          <w:kern w:val="2"/>
-          <w:sz w:val="28"/>
-          <w:szCs w:val="28"/>
-          <w:lang w:eastAsia="en-US"/>
-          <w14:ligatures w14:val="standardContextual"/>
-        </w:rPr>
-        <w:t>Successful steps in higher education to stop computer science students from attrition,</w:t>
-      </w:r>
-      <w:r>
-        <w:rPr>
-          <w:rFonts w:ascii="Times New Roman" w:eastAsiaTheme="minorEastAsia" w:hAnsiTheme="minorHAnsi" w:cstheme="minorBidi"/>
-          <w:color w:val="000000"/>
-          <w:kern w:val="2"/>
-          <w:sz w:val="28"/>
-          <w:szCs w:val="28"/>
-          <w:lang w:eastAsia="en-US"/>
-          <w14:ligatures w14:val="standardContextual"/>
-        </w:rPr>
-        <w:t>”</w:t>
-      </w:r>
-      <w:r>
-        <w:rPr>
-          <w:rFonts w:ascii="Times New Roman" w:eastAsiaTheme="minorEastAsia" w:hAnsiTheme="minorHAnsi" w:cstheme="minorBidi"/>
-          <w:color w:val="000000"/>
-          <w:kern w:val="2"/>
-          <w:sz w:val="28"/>
-          <w:szCs w:val="28"/>
-          <w:lang w:eastAsia="en-US"/>
-          <w14:ligatures w14:val="standardContextual"/>
-        </w:rPr>
-        <w:t xml:space="preserve"> Interchange, vol. 53, no. 3, pp. 637</w:t>
-      </w:r>
-      <w:r>
-        <w:rPr>
-          <w:rFonts w:ascii="Times New Roman" w:eastAsiaTheme="minorEastAsia" w:hAnsiTheme="minorHAnsi" w:cstheme="minorBidi"/>
-          <w:color w:val="000000"/>
-          <w:kern w:val="2"/>
-          <w:sz w:val="28"/>
-          <w:szCs w:val="28"/>
-          <w:lang w:eastAsia="en-US"/>
-          <w14:ligatures w14:val="standardContextual"/>
-        </w:rPr>
-        <w:t>–</w:t>
-      </w:r>
-      <w:r>
-        <w:rPr>
-          <w:rFonts w:ascii="Times New Roman" w:eastAsiaTheme="minorEastAsia" w:hAnsiTheme="minorHAnsi" w:cstheme="minorBidi"/>
-          <w:color w:val="000000"/>
-          <w:kern w:val="2"/>
-          <w:sz w:val="28"/>
-          <w:szCs w:val="28"/>
-          <w:lang w:eastAsia="en-US"/>
-          <w14:ligatures w14:val="standardContextual"/>
-        </w:rPr>
-        <w:t>652, 2022, doi: 10.1007/s10780-022-09476-2.</w:t>
+          <w:b/>
+          <w:bCs/>
+          <w:color w:val="000000"/>
+          <w:kern w:val="2"/>
+          <w:sz w:val="28"/>
+          <w:szCs w:val="22"/>
+          <w:lang w:eastAsia="en-US"/>
+          <w14:ligatures w14:val="standardContextual"/>
+        </w:rPr>
+      </w:pPr>
+    </w:p>
+    <w:p>
+      <w:pPr>
+        <w:widowControl w:val="0"/>
+        <w:autoSpaceDE w:val="0"/>
+        <w:autoSpaceDN w:val="0"/>
+        <w:spacing w:before="171" w:line="311" w:lineRule="exact"/>
+        <w:jc w:val="center"/>
+        <w:rPr>
+          <w:rFonts w:ascii="Times New Roman" w:eastAsiaTheme="minorEastAsia" w:hAnsiTheme="minorHAnsi" w:cstheme="minorBidi"/>
+          <w:b/>
+          <w:bCs/>
+          <w:color w:val="000000"/>
+          <w:kern w:val="2"/>
+          <w:sz w:val="28"/>
+          <w:szCs w:val="22"/>
+          <w:lang w:eastAsia="en-US"/>
+          <w14:ligatures w14:val="standardContextual"/>
+        </w:rPr>
+      </w:pPr>
+      <w:r>
+        <w:rPr>
+          <w:rFonts w:ascii="Times New Roman" w:eastAsiaTheme="minorEastAsia" w:hAnsiTheme="minorHAnsi" w:cstheme="minorBidi"/>
+          <w:b/>
+          <w:bCs/>
+          <w:color w:val="000000"/>
+          <w:kern w:val="2"/>
+          <w:sz w:val="28"/>
+          <w:szCs w:val="22"/>
+          <w:lang w:eastAsia="en-US"/>
+          <w14:ligatures w14:val="standardContextual"/>
+        </w:rPr>
+        <w:t>References</w:t>
       </w:r>
     </w:p>
     <w:p>
@@ -20413,7 +19965,8 @@
           <w:lang w:eastAsia="en-US"/>
           <w14:ligatures w14:val="standardContextual"/>
         </w:rPr>
-        <w:t xml:space="preserve">[4] P. C. Siswipraptini, H. L. H. S. Warnars, A. Ramadhan, and W. Budiharto, </w:t>
+        <w:lastRenderedPageBreak/>
+        <w:t xml:space="preserve">[1] J. Tenenberg and D. Chinn, </w:t>
       </w:r>
       <w:r>
         <w:rPr>
@@ -20437,7 +19990,7 @@
           <w:lang w:eastAsia="en-US"/>
           <w14:ligatures w14:val="standardContextual"/>
         </w:rPr>
-        <w:t>Personalized career-path recommendation model for information technology students in Indonesia,</w:t>
+        <w:t>Epistemic practices in conceptions of computer science,</w:t>
       </w:r>
       <w:r>
         <w:rPr>
@@ -20461,7 +20014,7 @@
           <w:lang w:eastAsia="en-US"/>
           <w14:ligatures w14:val="standardContextual"/>
         </w:rPr>
-        <w:t xml:space="preserve"> IEEE Access, vol. 12, pp. 49092</w:t>
+        <w:t xml:space="preserve"> Comput. Sci. Educ., vol. 35, no. 1, pp. 190</w:t>
       </w:r>
       <w:r>
         <w:rPr>
@@ -20485,7 +20038,7 @@
           <w:lang w:eastAsia="en-US"/>
           <w14:ligatures w14:val="standardContextual"/>
         </w:rPr>
-        <w:t>49105, 2024, doi: 10.1109/ACCESS.2024.3381032.</w:t>
+        <w:t>211, 2025, doi: 10.1080/08993408.2024.2381398.</w:t>
       </w:r>
     </w:p>
     <w:p>
@@ -20515,7 +20068,7 @@
           <w:lang w:eastAsia="en-US"/>
           <w14:ligatures w14:val="standardContextual"/>
         </w:rPr>
-        <w:t xml:space="preserve">[5] J. Rosenberger, L. Wolfrum, S. Weinzierl, M. Kraus, and P. Zschech, </w:t>
+        <w:t xml:space="preserve">[2] K. Dzialets, A. Makeeva, I. Vlasov, A. Potriasaeva, A. Rostovskii, Y. Golubev, and A. Birillo, </w:t>
       </w:r>
       <w:r>
         <w:rPr>
@@ -20539,7 +20092,7 @@
           <w:lang w:eastAsia="en-US"/>
           <w14:ligatures w14:val="standardContextual"/>
         </w:rPr>
-        <w:t>CareerBERT: Matching resumes to ESCO jobs in a shared embedding space for generic job recommendations,</w:t>
+        <w:t>Everything you need to know about CS education: Open results from a survey of more than 18,000 participants,</w:t>
       </w:r>
       <w:r>
         <w:rPr>
@@ -20563,7 +20116,55 @@
           <w:lang w:eastAsia="en-US"/>
           <w14:ligatures w14:val="standardContextual"/>
         </w:rPr>
-        <w:t xml:space="preserve"> Expert Syst. Appl., vol. 275, Art. no. 127043, 2025, doi: 10.1016/j.eswa.2025.127043.</w:t>
+        <w:t xml:space="preserve"> in Proc. ACM Global Comput. Educ. Conf. (CompEd </w:t>
+      </w:r>
+      <w:r>
+        <w:rPr>
+          <w:rFonts w:ascii="Times New Roman" w:eastAsiaTheme="minorEastAsia" w:hAnsiTheme="minorHAnsi" w:cstheme="minorBidi"/>
+          <w:color w:val="000000"/>
+          <w:kern w:val="2"/>
+          <w:sz w:val="28"/>
+          <w:szCs w:val="28"/>
+          <w:lang w:eastAsia="en-US"/>
+          <w14:ligatures w14:val="standardContextual"/>
+        </w:rPr>
+        <w:t>’</w:t>
+      </w:r>
+      <w:r>
+        <w:rPr>
+          <w:rFonts w:ascii="Times New Roman" w:eastAsiaTheme="minorEastAsia" w:hAnsiTheme="minorHAnsi" w:cstheme="minorBidi"/>
+          <w:color w:val="000000"/>
+          <w:kern w:val="2"/>
+          <w:sz w:val="28"/>
+          <w:szCs w:val="28"/>
+          <w:lang w:eastAsia="en-US"/>
+          <w14:ligatures w14:val="standardContextual"/>
+        </w:rPr>
+        <w:t>25), Gaborone, Botswana, 2025, pp. 50</w:t>
+      </w:r>
+      <w:r>
+        <w:rPr>
+          <w:rFonts w:ascii="Times New Roman" w:eastAsiaTheme="minorEastAsia" w:hAnsiTheme="minorHAnsi" w:cstheme="minorBidi"/>
+          <w:color w:val="000000"/>
+          <w:kern w:val="2"/>
+          <w:sz w:val="28"/>
+          <w:szCs w:val="28"/>
+          <w:lang w:eastAsia="en-US"/>
+          <w14:ligatures w14:val="standardContextual"/>
+        </w:rPr>
+        <w:t>–</w:t>
+      </w:r>
+      <w:r>
+        <w:rPr>
+          <w:rFonts w:ascii="Times New Roman" w:eastAsiaTheme="minorEastAsia" w:hAnsiTheme="minorHAnsi" w:cstheme="minorBidi"/>
+          <w:color w:val="000000"/>
+          <w:kern w:val="2"/>
+          <w:sz w:val="28"/>
+          <w:szCs w:val="28"/>
+          <w:lang w:eastAsia="en-US"/>
+          <w14:ligatures w14:val="standardContextual"/>
+        </w:rPr>
+        <w:t>56, doi: 10.1145/3736181.3747133.</w:t>
       </w:r>
     </w:p>
     <w:p>
@@ -20593,19 +20194,162 @@
           <w:lang w:eastAsia="en-US"/>
           <w14:ligatures w14:val="standardContextual"/>
         </w:rPr>
-        <w:t xml:space="preserve">[6] S. Ashrafi, B. Majidi, E. Akhtarkavan, and S. H. Razavi Hajiagha, </w:t>
-      </w:r>
-      <w:r>
-        <w:rPr>
-          <w:rFonts w:ascii="Times New Roman" w:eastAsiaTheme="minorEastAsia" w:hAnsiTheme="minorHAnsi" w:cstheme="minorBidi"/>
-          <w:color w:val="000000"/>
-          <w:kern w:val="2"/>
-          <w:sz w:val="28"/>
-          <w:szCs w:val="28"/>
-          <w:lang w:eastAsia="en-US"/>
-          <w14:ligatures w14:val="standardContextual"/>
-        </w:rPr>
-        <w:lastRenderedPageBreak/>
+        <w:t>[3] R. Tak</w:t>
+      </w:r>
+      <w:r>
+        <w:rPr>
+          <w:rFonts w:ascii="Times New Roman" w:eastAsiaTheme="minorEastAsia" w:hAnsiTheme="minorHAnsi" w:cstheme="minorBidi"/>
+          <w:color w:val="000000"/>
+          <w:kern w:val="2"/>
+          <w:sz w:val="28"/>
+          <w:szCs w:val="28"/>
+          <w:lang w:eastAsia="en-US"/>
+          <w14:ligatures w14:val="standardContextual"/>
+        </w:rPr>
+        <w:t>á</w:t>
+      </w:r>
+      <w:r>
+        <w:rPr>
+          <w:rFonts w:ascii="Times New Roman" w:eastAsiaTheme="minorEastAsia" w:hAnsiTheme="minorHAnsi" w:cstheme="minorBidi"/>
+          <w:color w:val="000000"/>
+          <w:kern w:val="2"/>
+          <w:sz w:val="28"/>
+          <w:szCs w:val="28"/>
+          <w:lang w:eastAsia="en-US"/>
+          <w14:ligatures w14:val="standardContextual"/>
+        </w:rPr>
+        <w:t>cs, J. T. K</w:t>
+      </w:r>
+      <w:r>
+        <w:rPr>
+          <w:rFonts w:ascii="Times New Roman" w:eastAsiaTheme="minorEastAsia" w:hAnsiTheme="minorHAnsi" w:cstheme="minorBidi"/>
+          <w:color w:val="000000"/>
+          <w:kern w:val="2"/>
+          <w:sz w:val="28"/>
+          <w:szCs w:val="28"/>
+          <w:lang w:eastAsia="en-US"/>
+          <w14:ligatures w14:val="standardContextual"/>
+        </w:rPr>
+        <w:t>á</w:t>
+      </w:r>
+      <w:r>
+        <w:rPr>
+          <w:rFonts w:ascii="Times New Roman" w:eastAsiaTheme="minorEastAsia" w:hAnsiTheme="minorHAnsi" w:cstheme="minorBidi"/>
+          <w:color w:val="000000"/>
+          <w:kern w:val="2"/>
+          <w:sz w:val="28"/>
+          <w:szCs w:val="28"/>
+          <w:lang w:eastAsia="en-US"/>
+          <w14:ligatures w14:val="standardContextual"/>
+        </w:rPr>
+        <w:t>r</w:t>
+      </w:r>
+      <w:r>
+        <w:rPr>
+          <w:rFonts w:ascii="Times New Roman" w:eastAsiaTheme="minorEastAsia" w:hAnsiTheme="minorHAnsi" w:cstheme="minorBidi"/>
+          <w:color w:val="000000"/>
+          <w:kern w:val="2"/>
+          <w:sz w:val="28"/>
+          <w:szCs w:val="28"/>
+          <w:lang w:eastAsia="en-US"/>
+          <w14:ligatures w14:val="standardContextual"/>
+        </w:rPr>
+        <w:t>á</w:t>
+      </w:r>
+      <w:r>
+        <w:rPr>
+          <w:rFonts w:ascii="Times New Roman" w:eastAsiaTheme="minorEastAsia" w:hAnsiTheme="minorHAnsi" w:cstheme="minorBidi"/>
+          <w:color w:val="000000"/>
+          <w:kern w:val="2"/>
+          <w:sz w:val="28"/>
+          <w:szCs w:val="28"/>
+          <w:lang w:eastAsia="en-US"/>
+          <w14:ligatures w14:val="standardContextual"/>
+        </w:rPr>
+        <w:t>sz, S. Tak</w:t>
+      </w:r>
+      <w:r>
+        <w:rPr>
+          <w:rFonts w:ascii="Times New Roman" w:eastAsiaTheme="minorEastAsia" w:hAnsiTheme="minorHAnsi" w:cstheme="minorBidi"/>
+          <w:color w:val="000000"/>
+          <w:kern w:val="2"/>
+          <w:sz w:val="28"/>
+          <w:szCs w:val="28"/>
+          <w:lang w:eastAsia="en-US"/>
+          <w14:ligatures w14:val="standardContextual"/>
+        </w:rPr>
+        <w:t>á</w:t>
+      </w:r>
+      <w:r>
+        <w:rPr>
+          <w:rFonts w:ascii="Times New Roman" w:eastAsiaTheme="minorEastAsia" w:hAnsiTheme="minorHAnsi" w:cstheme="minorBidi"/>
+          <w:color w:val="000000"/>
+          <w:kern w:val="2"/>
+          <w:sz w:val="28"/>
+          <w:szCs w:val="28"/>
+          <w:lang w:eastAsia="en-US"/>
+          <w14:ligatures w14:val="standardContextual"/>
+        </w:rPr>
+        <w:t>cs, Z. Horv</w:t>
+      </w:r>
+      <w:r>
+        <w:rPr>
+          <w:rFonts w:ascii="Times New Roman" w:eastAsiaTheme="minorEastAsia" w:hAnsiTheme="minorHAnsi" w:cstheme="minorBidi"/>
+          <w:color w:val="000000"/>
+          <w:kern w:val="2"/>
+          <w:sz w:val="28"/>
+          <w:szCs w:val="28"/>
+          <w:lang w:eastAsia="en-US"/>
+          <w14:ligatures w14:val="standardContextual"/>
+        </w:rPr>
+        <w:t>á</w:t>
+      </w:r>
+      <w:r>
+        <w:rPr>
+          <w:rFonts w:ascii="Times New Roman" w:eastAsiaTheme="minorEastAsia" w:hAnsiTheme="minorHAnsi" w:cstheme="minorBidi"/>
+          <w:color w:val="000000"/>
+          <w:kern w:val="2"/>
+          <w:sz w:val="28"/>
+          <w:szCs w:val="28"/>
+          <w:lang w:eastAsia="en-US"/>
+          <w14:ligatures w14:val="standardContextual"/>
+        </w:rPr>
+        <w:t>th, and A. Ol</w:t>
+      </w:r>
+      <w:r>
+        <w:rPr>
+          <w:rFonts w:ascii="Times New Roman" w:eastAsiaTheme="minorEastAsia" w:hAnsiTheme="minorHAnsi" w:cstheme="minorBidi"/>
+          <w:color w:val="000000"/>
+          <w:kern w:val="2"/>
+          <w:sz w:val="28"/>
+          <w:szCs w:val="28"/>
+          <w:lang w:eastAsia="en-US"/>
+          <w14:ligatures w14:val="standardContextual"/>
+        </w:rPr>
+        <w:t>á</w:t>
+      </w:r>
+      <w:r>
+        <w:rPr>
+          <w:rFonts w:ascii="Times New Roman" w:eastAsiaTheme="minorEastAsia" w:hAnsiTheme="minorHAnsi" w:cstheme="minorBidi"/>
+          <w:color w:val="000000"/>
+          <w:kern w:val="2"/>
+          <w:sz w:val="28"/>
+          <w:szCs w:val="28"/>
+          <w:lang w:eastAsia="en-US"/>
+          <w14:ligatures w14:val="standardContextual"/>
+        </w:rPr>
+        <w:t xml:space="preserve">h, </w:t>
+      </w:r>
+      <w:r>
+        <w:rPr>
+          <w:rFonts w:ascii="Times New Roman" w:eastAsiaTheme="minorEastAsia" w:hAnsiTheme="minorHAnsi" w:cstheme="minorBidi"/>
+          <w:color w:val="000000"/>
+          <w:kern w:val="2"/>
+          <w:sz w:val="28"/>
+          <w:szCs w:val="28"/>
+          <w:lang w:eastAsia="en-US"/>
+          <w14:ligatures w14:val="standardContextual"/>
+        </w:rPr>
         <w:t>“</w:t>
       </w:r>
       <w:r>
@@ -20618,7 +20362,7 @@
           <w:lang w:eastAsia="en-US"/>
           <w14:ligatures w14:val="standardContextual"/>
         </w:rPr>
-        <w:t>Efficient resume-based re-education for career recommendation in rapidly evolving job markets,</w:t>
+        <w:t>Successful steps in higher education to stop computer science students from attrition,</w:t>
       </w:r>
       <w:r>
         <w:rPr>
@@ -20642,7 +20386,7 @@
           <w:lang w:eastAsia="en-US"/>
           <w14:ligatures w14:val="standardContextual"/>
         </w:rPr>
-        <w:t xml:space="preserve"> IEEE Access, vol. 11, pp. 124350</w:t>
+        <w:t xml:space="preserve"> Interchange, vol. 53, no. 3, pp. 637</w:t>
       </w:r>
       <w:r>
         <w:rPr>
@@ -20666,7 +20410,7 @@
           <w:lang w:eastAsia="en-US"/>
           <w14:ligatures w14:val="standardContextual"/>
         </w:rPr>
-        <w:t>124367, 2023, doi: 10.1109/ACCESS.2023.3329576.</w:t>
+        <w:t>652, 2022, doi: 10.1007/s10780-022-09476-2.</w:t>
       </w:r>
     </w:p>
     <w:p>
@@ -20696,7 +20440,7 @@
           <w:lang w:eastAsia="en-US"/>
           <w14:ligatures w14:val="standardContextual"/>
         </w:rPr>
-        <w:t xml:space="preserve">[7] S. Ji, S. Pan, E. Cambria, P. Marttinen, and P. S. Yu, </w:t>
+        <w:t xml:space="preserve">[4] P. C. Siswipraptini, H. L. H. S. Warnars, A. Ramadhan, and W. Budiharto, </w:t>
       </w:r>
       <w:r>
         <w:rPr>
@@ -20720,7 +20464,7 @@
           <w:lang w:eastAsia="en-US"/>
           <w14:ligatures w14:val="standardContextual"/>
         </w:rPr>
-        <w:t>A survey on knowledge graphs: Representation, acquisition, and applications,</w:t>
+        <w:t>Personalized career-path recommendation model for information technology students in Indonesia,</w:t>
       </w:r>
       <w:r>
         <w:rPr>
@@ -20744,7 +20488,7 @@
           <w:lang w:eastAsia="en-US"/>
           <w14:ligatures w14:val="standardContextual"/>
         </w:rPr>
-        <w:t xml:space="preserve"> IEEE Trans. Neural Netw. Learn. Syst., vol. 33, no. 2, pp. 494</w:t>
+        <w:t xml:space="preserve"> IEEE Access, vol. 12, pp. 49092</w:t>
       </w:r>
       <w:r>
         <w:rPr>
@@ -20768,7 +20512,7 @@
           <w:lang w:eastAsia="en-US"/>
           <w14:ligatures w14:val="standardContextual"/>
         </w:rPr>
-        <w:t>514, Feb. 2022, doi: 10.1109/TNNLS.2021.3070843.</w:t>
+        <w:t>49105, 2024, doi: 10.1109/ACCESS.2024.3381032.</w:t>
       </w:r>
     </w:p>
     <w:p>
@@ -20798,7 +20542,7 @@
           <w:lang w:eastAsia="en-US"/>
           <w14:ligatures w14:val="standardContextual"/>
         </w:rPr>
-        <w:t xml:space="preserve">[8] J. Cao, J. Fang, Z. Meng, and S. Liang, </w:t>
+        <w:t xml:space="preserve">[5] J. Rosenberger, L. Wolfrum, S. Weinzierl, M. Kraus, and P. Zschech, </w:t>
       </w:r>
       <w:r>
         <w:rPr>
@@ -20822,7 +20566,7 @@
           <w:lang w:eastAsia="en-US"/>
           <w14:ligatures w14:val="standardContextual"/>
         </w:rPr>
-        <w:t>Knowledge graph embedding: A survey from the perspective of representation spaces,</w:t>
+        <w:t>CareerBERT: Matching resumes to ESCO jobs in a shared embedding space for generic job recommendations,</w:t>
       </w:r>
       <w:r>
         <w:rPr>
@@ -20846,31 +20590,7 @@
           <w:lang w:eastAsia="en-US"/>
           <w14:ligatures w14:val="standardContextual"/>
         </w:rPr>
-        <w:t xml:space="preserve"> ACM Comput. Surv., vol. 56, no. 6, pp. 1</w:t>
-      </w:r>
-      <w:r>
-        <w:rPr>
-          <w:rFonts w:ascii="Times New Roman" w:eastAsiaTheme="minorEastAsia" w:hAnsiTheme="minorHAnsi" w:cstheme="minorBidi"/>
-          <w:color w:val="000000"/>
-          <w:kern w:val="2"/>
-          <w:sz w:val="28"/>
-          <w:szCs w:val="28"/>
-          <w:lang w:eastAsia="en-US"/>
-          <w14:ligatures w14:val="standardContextual"/>
-        </w:rPr>
-        <w:t>–</w:t>
-      </w:r>
-      <w:r>
-        <w:rPr>
-          <w:rFonts w:ascii="Times New Roman" w:eastAsiaTheme="minorEastAsia" w:hAnsiTheme="minorHAnsi" w:cstheme="minorBidi"/>
-          <w:color w:val="000000"/>
-          <w:kern w:val="2"/>
-          <w:sz w:val="28"/>
-          <w:szCs w:val="28"/>
-          <w:lang w:eastAsia="en-US"/>
-          <w14:ligatures w14:val="standardContextual"/>
-        </w:rPr>
-        <w:t>42, Jun. 2024, doi: 10.1145/3643806.</w:t>
+        <w:t xml:space="preserve"> Expert Syst. Appl., vol. 275, Art. no. 127043, 2025, doi: 10.1016/j.eswa.2025.127043.</w:t>
       </w:r>
     </w:p>
     <w:p>
@@ -20900,7 +20620,7 @@
           <w:lang w:eastAsia="en-US"/>
           <w14:ligatures w14:val="standardContextual"/>
         </w:rPr>
-        <w:t xml:space="preserve">[9] X. Zhang, S. Liu, and H. Wang, </w:t>
+        <w:t xml:space="preserve">[6] S. Ashrafi, B. Majidi, E. Akhtarkavan, and S. H. Razavi Hajiagha, </w:t>
       </w:r>
       <w:r>
         <w:rPr>
@@ -20924,7 +20644,7 @@
           <w:lang w:eastAsia="en-US"/>
           <w14:ligatures w14:val="standardContextual"/>
         </w:rPr>
-        <w:t>Personalized learning path recommendation for e-learning based on knowledge graph and graph convolutional network,</w:t>
+        <w:t>Efficient resume-based re-education for career recommendation in rapidly evolving job markets,</w:t>
       </w:r>
       <w:r>
         <w:rPr>
@@ -20948,7 +20668,7 @@
           <w:lang w:eastAsia="en-US"/>
           <w14:ligatures w14:val="standardContextual"/>
         </w:rPr>
-        <w:t xml:space="preserve"> Int. J. Softw. Eng. Knowl. Eng., vol. 33, no. 1, pp. 109</w:t>
+        <w:t xml:space="preserve"> IEEE Access, vol. 11, pp. 124350</w:t>
       </w:r>
       <w:r>
         <w:rPr>
@@ -20972,7 +20692,7 @@
           <w:lang w:eastAsia="en-US"/>
           <w14:ligatures w14:val="standardContextual"/>
         </w:rPr>
-        <w:t>131, 2023, doi: 10.1142/S0218194022500681.</w:t>
+        <w:t>124367, 2023, doi: 10.1109/ACCESS.2023.3329576.</w:t>
       </w:r>
     </w:p>
     <w:p>
@@ -21002,7 +20722,7 @@
           <w:lang w:eastAsia="en-US"/>
           <w14:ligatures w14:val="standardContextual"/>
         </w:rPr>
-        <w:t xml:space="preserve">[10] X. Cheng, Z. Zhang, J. Wang, L. Fang, C. He, Q. Guan, S. Pan, and W. Luo, </w:t>
+        <w:t xml:space="preserve">[7] S. Ji, S. Pan, E. Cambria, P. Marttinen, and P. S. Yu, </w:t>
       </w:r>
       <w:r>
         <w:rPr>
@@ -21026,7 +20746,7 @@
           <w:lang w:eastAsia="en-US"/>
           <w14:ligatures w14:val="standardContextual"/>
         </w:rPr>
-        <w:t>GraphRAG-induced dual knowledge structure graphs for personalized learning path recommendation,</w:t>
+        <w:t>A survey on knowledge graphs: Representation, acquisition, and applications,</w:t>
       </w:r>
       <w:r>
         <w:rPr>
@@ -21050,7 +20770,7 @@
           <w:lang w:eastAsia="en-US"/>
           <w14:ligatures w14:val="standardContextual"/>
         </w:rPr>
-        <w:t xml:space="preserve"> in Proc. AAAI Conf. Artif. Intell., vol. 40, no. 17, 2026, pp. 14610</w:t>
+        <w:t xml:space="preserve"> IEEE Trans. Neural Netw. Learn. Syst., vol. 33, no. 2, pp. 494</w:t>
       </w:r>
       <w:r>
         <w:rPr>
@@ -21074,7 +20794,7 @@
           <w:lang w:eastAsia="en-US"/>
           <w14:ligatures w14:val="standardContextual"/>
         </w:rPr>
-        <w:t>14620, doi: 10.1609/aaai.v40i17.38479.</w:t>
+        <w:t>514, Feb. 2022, doi: 10.1109/TNNLS.2021.3070843.</w:t>
       </w:r>
     </w:p>
     <w:p>
@@ -21104,7 +20824,7 @@
           <w:lang w:eastAsia="en-US"/>
           <w14:ligatures w14:val="standardContextual"/>
         </w:rPr>
-        <w:t xml:space="preserve">[11] T. H. Cormen, C. E. Leiserson, R. L. Rivest, and C. Stein, Introduction to Algorithms, 4th ed. Cambridge, MA, USA: MIT Press, 2022, ch. 20, </w:t>
+        <w:t xml:space="preserve">[8] J. Cao, J. Fang, Z. Meng, and S. Liang, </w:t>
       </w:r>
       <w:r>
         <w:rPr>
@@ -21128,7 +20848,7 @@
           <w:lang w:eastAsia="en-US"/>
           <w14:ligatures w14:val="standardContextual"/>
         </w:rPr>
-        <w:t>Elementary graph algorithms,</w:t>
+        <w:t>Knowledge graph embedding: A survey from the perspective of representation spaces,</w:t>
       </w:r>
       <w:r>
         <w:rPr>
@@ -21152,7 +20872,7 @@
           <w:lang w:eastAsia="en-US"/>
           <w14:ligatures w14:val="standardContextual"/>
         </w:rPr>
-        <w:t xml:space="preserve"> sec. 20.4, pp. 573</w:t>
+        <w:t xml:space="preserve"> ACM Comput. Surv., vol. 56, no. 6, pp. 1</w:t>
       </w:r>
       <w:r>
         <w:rPr>
@@ -21176,7 +20896,7 @@
           <w:lang w:eastAsia="en-US"/>
           <w14:ligatures w14:val="standardContextual"/>
         </w:rPr>
-        <w:t>576.</w:t>
+        <w:t>42, Jun. 2024, doi: 10.1145/3643806.</w:t>
       </w:r>
     </w:p>
     <w:p>
@@ -21206,7 +20926,7 @@
           <w:lang w:eastAsia="en-US"/>
           <w14:ligatures w14:val="standardContextual"/>
         </w:rPr>
-        <w:t xml:space="preserve">[12] N. Reimers and I. Gurevych, </w:t>
+        <w:t xml:space="preserve">[9] X. Zhang, S. Liu, and H. Wang, </w:t>
       </w:r>
       <w:r>
         <w:rPr>
@@ -21230,7 +20950,7 @@
           <w:lang w:eastAsia="en-US"/>
           <w14:ligatures w14:val="standardContextual"/>
         </w:rPr>
-        <w:t>Sentence-BERT: Sentence embeddings using Siamese BERT-networks,</w:t>
+        <w:t>Personalized learning path recommendation for e-learning based on knowledge graph and graph convolutional network,</w:t>
       </w:r>
       <w:r>
         <w:rPr>
@@ -21254,7 +20974,7 @@
           <w:lang w:eastAsia="en-US"/>
           <w14:ligatures w14:val="standardContextual"/>
         </w:rPr>
-        <w:t xml:space="preserve"> in Proc. Conf. Empirical Methods Natural Lang. Process. and 9th Int. Joint Conf. Natural Lang. Process. (EMNLP-IJCNLP), Hong Kong, China, 2019, pp. 3982</w:t>
+        <w:t xml:space="preserve"> Int. J. Softw. Eng. Knowl. Eng., vol. 33, no. 1, pp. 109</w:t>
       </w:r>
       <w:r>
         <w:rPr>
@@ -21278,7 +20998,7 @@
           <w:lang w:eastAsia="en-US"/>
           <w14:ligatures w14:val="standardContextual"/>
         </w:rPr>
-        <w:t>3992, doi: 10.18653/v1/D19-1410.</w:t>
+        <w:t>131, 2023, doi: 10.1142/S0218194022500681.</w:t>
       </w:r>
     </w:p>
     <w:p>
@@ -21308,7 +21028,7 @@
           <w:lang w:eastAsia="en-US"/>
           <w14:ligatures w14:val="standardContextual"/>
         </w:rPr>
-        <w:t xml:space="preserve">[13] M. Murtaza, Y. Ahmed, J. A. Shamsi, F. Sherwani, and M. Usman, </w:t>
+        <w:t xml:space="preserve">[10] X. Cheng, Z. Zhang, J. Wang, L. Fang, C. He, Q. Guan, S. Pan, and W. Luo, </w:t>
       </w:r>
       <w:r>
         <w:rPr>
@@ -21332,7 +21052,7 @@
           <w:lang w:eastAsia="en-US"/>
           <w14:ligatures w14:val="standardContextual"/>
         </w:rPr>
-        <w:t>AI-based personalized e-learning systems: Issues, challenges, and solutions,</w:t>
+        <w:t>GraphRAG-induced dual knowledge structure graphs for personalized learning path recommendation,</w:t>
       </w:r>
       <w:r>
         <w:rPr>
@@ -21356,7 +21076,7 @@
           <w:lang w:eastAsia="en-US"/>
           <w14:ligatures w14:val="standardContextual"/>
         </w:rPr>
-        <w:t xml:space="preserve"> IEEE Access, vol. 10, pp. 81323</w:t>
+        <w:t xml:space="preserve"> in Proc. AAAI Conf. Artif. Intell., vol. 40, no. 17, 2026, pp. 14610</w:t>
       </w:r>
       <w:r>
         <w:rPr>
@@ -21380,7 +21100,20 @@
           <w:lang w:eastAsia="en-US"/>
           <w14:ligatures w14:val="standardContextual"/>
         </w:rPr>
-        <w:t>81342, 2022, doi: 10.1109/ACCESS.2022.3193938.</w:t>
+        <w:t xml:space="preserve">14620, doi: </w:t>
+      </w:r>
+      <w:r>
+        <w:rPr>
+          <w:rFonts w:ascii="Times New Roman" w:eastAsiaTheme="minorEastAsia" w:hAnsiTheme="minorHAnsi" w:cstheme="minorBidi"/>
+          <w:color w:val="000000"/>
+          <w:kern w:val="2"/>
+          <w:sz w:val="28"/>
+          <w:szCs w:val="28"/>
+          <w:lang w:eastAsia="en-US"/>
+          <w14:ligatures w14:val="standardContextual"/>
+        </w:rPr>
+        <w:lastRenderedPageBreak/>
+        <w:t>10.1609/aaai.v40i17.38479.</w:t>
       </w:r>
     </w:p>
     <w:p>
@@ -21410,7 +21143,7 @@
           <w:lang w:eastAsia="en-US"/>
           <w14:ligatures w14:val="standardContextual"/>
         </w:rPr>
-        <w:t xml:space="preserve">[14] B. Qiu, M. F. Zuhairi, and J. Morcos, </w:t>
+        <w:t xml:space="preserve">[11] T. H. Cormen, C. E. Leiserson, R. L. Rivest, and C. Stein, Introduction to Algorithms, 4th ed. Cambridge, MA, USA: MIT Press, 2022, ch. 20, </w:t>
       </w:r>
       <w:r>
         <w:rPr>
@@ -21434,7 +21167,7 @@
           <w:lang w:eastAsia="en-US"/>
           <w14:ligatures w14:val="standardContextual"/>
         </w:rPr>
-        <w:t>A comprehensive study on personalized learning recommendation in e-learning system,</w:t>
+        <w:t>Elementary graph algorithms,</w:t>
       </w:r>
       <w:r>
         <w:rPr>
@@ -21458,7 +21191,7 @@
           <w:lang w:eastAsia="en-US"/>
           <w14:ligatures w14:val="standardContextual"/>
         </w:rPr>
-        <w:t xml:space="preserve"> IEEE Access, vol. 12, pp. 100446</w:t>
+        <w:t xml:space="preserve"> sec. 20.4, pp. 573</w:t>
       </w:r>
       <w:r>
         <w:rPr>
@@ -21482,7 +21215,7 @@
           <w:lang w:eastAsia="en-US"/>
           <w14:ligatures w14:val="standardContextual"/>
         </w:rPr>
-        <w:t>100482, 2024, doi: 10.1109/ACCESS.2024.3428419.</w:t>
+        <w:t>576.</w:t>
       </w:r>
     </w:p>
     <w:p>
@@ -21512,7 +21245,7 @@
           <w:lang w:eastAsia="en-US"/>
           <w14:ligatures w14:val="standardContextual"/>
         </w:rPr>
-        <w:t xml:space="preserve">[15] G. M. Dhananjaya, R. H. Goudar, A. A. Kulkarni, and V. N. Rathod, </w:t>
+        <w:t xml:space="preserve">[12] N. Reimers and I. Gurevych, </w:t>
       </w:r>
       <w:r>
         <w:rPr>
@@ -21536,7 +21269,7 @@
           <w:lang w:eastAsia="en-US"/>
           <w14:ligatures w14:val="standardContextual"/>
         </w:rPr>
-        <w:t>A digital recommendation system for personalized learning to enhance online education: A review,</w:t>
+        <w:t>Sentence-BERT: Sentence embeddings using Siamese BERT-networks,</w:t>
       </w:r>
       <w:r>
         <w:rPr>
@@ -21560,7 +21293,7 @@
           <w:lang w:eastAsia="en-US"/>
           <w14:ligatures w14:val="standardContextual"/>
         </w:rPr>
-        <w:t xml:space="preserve"> IEEE Access, vol. 12, pp. 34019</w:t>
+        <w:t xml:space="preserve"> in Proc. Conf. Empirical Methods Natural Lang. Process. and 9th Int. Joint Conf. Natural Lang. Process. (EMNLP-IJCNLP), Hong Kong, China, 2019, pp. 3982</w:t>
       </w:r>
       <w:r>
         <w:rPr>
@@ -21584,7 +21317,7 @@
           <w:lang w:eastAsia="en-US"/>
           <w14:ligatures w14:val="standardContextual"/>
         </w:rPr>
-        <w:t>34041, 2024, doi: 10.1109/ACCESS.2024.3369901.</w:t>
+        <w:t>3992, doi: 10.18653/v1/D19-1410.</w:t>
       </w:r>
     </w:p>
     <w:p>
@@ -21614,8 +21347,7 @@
           <w:lang w:eastAsia="en-US"/>
           <w14:ligatures w14:val="standardContextual"/>
         </w:rPr>
-        <w:lastRenderedPageBreak/>
-        <w:t xml:space="preserve">[16] X. Yu, S. Yang, Z. Wang, S. Song, H. Ma, Z. Cao, and X. Zhang, </w:t>
+        <w:t xml:space="preserve">[13] M. Murtaza, Y. Ahmed, J. A. Shamsi, F. Sherwani, and M. Usman, </w:t>
       </w:r>
       <w:r>
         <w:rPr>
@@ -21639,7 +21371,7 @@
           <w:lang w:eastAsia="en-US"/>
           <w14:ligatures w14:val="standardContextual"/>
         </w:rPr>
-        <w:t>LIGHT: Enhancing learning path recommendation via knowledge topology-aware sequence optimization,</w:t>
+        <w:t>AI-based personalized e-learning systems: Issues, challenges, and solutions,</w:t>
       </w:r>
       <w:r>
         <w:rPr>
@@ -21663,31 +21395,7 @@
           <w:lang w:eastAsia="en-US"/>
           <w14:ligatures w14:val="standardContextual"/>
         </w:rPr>
-        <w:t xml:space="preserve"> in Proc. 48th Int. ACM SIGIR Conf. Res. Develop. Inf. Retrieval (SIGIR </w:t>
-      </w:r>
-      <w:r>
-        <w:rPr>
-          <w:rFonts w:ascii="Times New Roman" w:eastAsiaTheme="minorEastAsia" w:hAnsiTheme="minorHAnsi" w:cstheme="minorBidi"/>
-          <w:color w:val="000000"/>
-          <w:kern w:val="2"/>
-          <w:sz w:val="28"/>
-          <w:szCs w:val="28"/>
-          <w:lang w:eastAsia="en-US"/>
-          <w14:ligatures w14:val="standardContextual"/>
-        </w:rPr>
-        <w:t>’</w:t>
-      </w:r>
-      <w:r>
-        <w:rPr>
-          <w:rFonts w:ascii="Times New Roman" w:eastAsiaTheme="minorEastAsia" w:hAnsiTheme="minorHAnsi" w:cstheme="minorBidi"/>
-          <w:color w:val="000000"/>
-          <w:kern w:val="2"/>
-          <w:sz w:val="28"/>
-          <w:szCs w:val="28"/>
-          <w:lang w:eastAsia="en-US"/>
-          <w14:ligatures w14:val="standardContextual"/>
-        </w:rPr>
-        <w:t>25), Padua, Italy, 2025, pp. 306</w:t>
+        <w:t xml:space="preserve"> IEEE Access, vol. 10, pp. 81323</w:t>
       </w:r>
       <w:r>
         <w:rPr>
@@ -21711,7 +21419,7 @@
           <w:lang w:eastAsia="en-US"/>
           <w14:ligatures w14:val="standardContextual"/>
         </w:rPr>
-        <w:t>315, doi: 10.1145/3726302.3730022.</w:t>
+        <w:t>81342, 2022, doi: 10.1109/ACCESS.2022.3193938.</w:t>
       </w:r>
     </w:p>
     <w:p>
@@ -21741,7 +21449,7 @@
           <w:lang w:eastAsia="en-US"/>
           <w14:ligatures w14:val="standardContextual"/>
         </w:rPr>
-        <w:t xml:space="preserve">[17] roadmap.sh, </w:t>
+        <w:t xml:space="preserve">[14] B. Qiu, M. F. Zuhairi, and J. Morcos, </w:t>
       </w:r>
       <w:r>
         <w:rPr>
@@ -21765,7 +21473,7 @@
           <w:lang w:eastAsia="en-US"/>
           <w14:ligatures w14:val="standardContextual"/>
         </w:rPr>
-        <w:t>Developer Roadmaps,</w:t>
+        <w:t>A comprehensive study on personalized learning recommendation in e-learning system,</w:t>
       </w:r>
       <w:r>
         <w:rPr>
@@ -21789,46 +21497,31 @@
           <w:lang w:eastAsia="en-US"/>
           <w14:ligatures w14:val="standardContextual"/>
         </w:rPr>
-        <w:t xml:space="preserve"> [Online]. Available: </w:t>
-      </w:r>
-      <w:r>
-        <w:rPr>
-          <w:rStyle w:val="Hyperlink"/>
-          <w:sz w:val="28"/>
-          <w:szCs w:val="28"/>
-          <w:lang w:eastAsia="en-US"/>
-        </w:rPr>
-        <w:t>https://roadmap.sh/</w:t>
-      </w:r>
-      <w:r>
-        <w:rPr>
-          <w:rStyle w:val="Hyperlink"/>
-          <w:sz w:val="28"/>
-          <w:szCs w:val="28"/>
-          <w:lang w:eastAsia="en-US"/>
-        </w:rPr>
-        <w:t>.</w:t>
-      </w:r>
-      <w:r>
-        <w:rPr>
-          <w:rStyle w:val="Hyperlink"/>
-          <w:sz w:val="28"/>
-          <w:szCs w:val="28"/>
-          <w:lang w:eastAsia="en-US"/>
-        </w:rPr>
-        <w:t xml:space="preserve"> </w:t>
-      </w:r>
-      <w:r>
-        <w:rPr>
-          <w:rFonts w:ascii="Times New Roman" w:eastAsiaTheme="minorEastAsia" w:hAnsiTheme="minorHAnsi" w:cstheme="minorBidi"/>
-          <w:color w:val="000000"/>
-          <w:kern w:val="2"/>
-          <w:sz w:val="28"/>
-          <w:szCs w:val="28"/>
-          <w:lang w:eastAsia="en-US"/>
-          <w14:ligatures w14:val="standardContextual"/>
-        </w:rPr>
-        <w:t>[Accessed: Oct. 6, 2026].</w:t>
+        <w:t xml:space="preserve"> IEEE Access, vol. 12, pp. 100446</w:t>
+      </w:r>
+      <w:r>
+        <w:rPr>
+          <w:rFonts w:ascii="Times New Roman" w:eastAsiaTheme="minorEastAsia" w:hAnsiTheme="minorHAnsi" w:cstheme="minorBidi"/>
+          <w:color w:val="000000"/>
+          <w:kern w:val="2"/>
+          <w:sz w:val="28"/>
+          <w:szCs w:val="28"/>
+          <w:lang w:eastAsia="en-US"/>
+          <w14:ligatures w14:val="standardContextual"/>
+        </w:rPr>
+        <w:t>–</w:t>
+      </w:r>
+      <w:r>
+        <w:rPr>
+          <w:rFonts w:ascii="Times New Roman" w:eastAsiaTheme="minorEastAsia" w:hAnsiTheme="minorHAnsi" w:cstheme="minorBidi"/>
+          <w:color w:val="000000"/>
+          <w:kern w:val="2"/>
+          <w:sz w:val="28"/>
+          <w:szCs w:val="28"/>
+          <w:lang w:eastAsia="en-US"/>
+          <w14:ligatures w14:val="standardContextual"/>
+        </w:rPr>
+        <w:t>100482, 2024, doi: 10.1109/ACCESS.2024.3428419.</w:t>
       </w:r>
     </w:p>
     <w:p>
@@ -21858,7 +21551,7 @@
           <w:lang w:eastAsia="en-US"/>
           <w14:ligatures w14:val="standardContextual"/>
         </w:rPr>
-        <w:t xml:space="preserve">[18] Learn Anything, </w:t>
+        <w:t xml:space="preserve">[15] G. M. Dhananjaya, R. H. Goudar, A. A. Kulkarni, and V. N. Rathod, </w:t>
       </w:r>
       <w:r>
         <w:rPr>
@@ -21882,7 +21575,7 @@
           <w:lang w:eastAsia="en-US"/>
           <w14:ligatures w14:val="standardContextual"/>
         </w:rPr>
-        <w:t>Learn Anything,</w:t>
+        <w:t>A digital recommendation system for personalized learning to enhance online education: A review,</w:t>
       </w:r>
       <w:r>
         <w:rPr>
@@ -21906,28 +21599,31 @@
           <w:lang w:eastAsia="en-US"/>
           <w14:ligatures w14:val="standardContextual"/>
         </w:rPr>
-        <w:t xml:space="preserve"> [Online]. Available: </w:t>
-      </w:r>
-      <w:r>
-        <w:rPr>
-          <w:rStyle w:val="Hyperlink"/>
-          <w:sz w:val="28"/>
-          <w:szCs w:val="28"/>
-          <w:lang w:eastAsia="en-US"/>
-        </w:rPr>
-        <w:t>https://learn-anything.xyz/.</w:t>
-      </w:r>
-      <w:r>
-        <w:rPr>
-          <w:rFonts w:ascii="Times New Roman" w:eastAsiaTheme="minorEastAsia" w:hAnsiTheme="minorHAnsi" w:cstheme="minorBidi"/>
-          <w:color w:val="000000"/>
-          <w:kern w:val="2"/>
-          <w:sz w:val="28"/>
-          <w:szCs w:val="28"/>
-          <w:lang w:eastAsia="en-US"/>
-          <w14:ligatures w14:val="standardContextual"/>
-        </w:rPr>
-        <w:t xml:space="preserve"> [Accessed: Oct. 6, 2026].</w:t>
+        <w:t xml:space="preserve"> IEEE Access, vol. 12, pp. 34019</w:t>
+      </w:r>
+      <w:r>
+        <w:rPr>
+          <w:rFonts w:ascii="Times New Roman" w:eastAsiaTheme="minorEastAsia" w:hAnsiTheme="minorHAnsi" w:cstheme="minorBidi"/>
+          <w:color w:val="000000"/>
+          <w:kern w:val="2"/>
+          <w:sz w:val="28"/>
+          <w:szCs w:val="28"/>
+          <w:lang w:eastAsia="en-US"/>
+          <w14:ligatures w14:val="standardContextual"/>
+        </w:rPr>
+        <w:t>–</w:t>
+      </w:r>
+      <w:r>
+        <w:rPr>
+          <w:rFonts w:ascii="Times New Roman" w:eastAsiaTheme="minorEastAsia" w:hAnsiTheme="minorHAnsi" w:cstheme="minorBidi"/>
+          <w:color w:val="000000"/>
+          <w:kern w:val="2"/>
+          <w:sz w:val="28"/>
+          <w:szCs w:val="28"/>
+          <w:lang w:eastAsia="en-US"/>
+          <w14:ligatures w14:val="standardContextual"/>
+        </w:rPr>
+        <w:t>34041, 2024, doi: 10.1109/ACCESS.2024.3369901.</w:t>
       </w:r>
     </w:p>
     <w:p>
@@ -21957,7 +21653,7 @@
           <w:lang w:eastAsia="en-US"/>
           <w14:ligatures w14:val="standardContextual"/>
         </w:rPr>
-        <w:t xml:space="preserve">[19] Mochivia, </w:t>
+        <w:t xml:space="preserve">[16] X. Yu, S. Yang, Z. Wang, S. Song, H. Ma, Z. Cao, and X. Zhang, </w:t>
       </w:r>
       <w:r>
         <w:rPr>
@@ -21981,7 +21677,7 @@
           <w:lang w:eastAsia="en-US"/>
           <w14:ligatures w14:val="standardContextual"/>
         </w:rPr>
-        <w:t>Learn Anything, Actually Follow Through,</w:t>
+        <w:t>LIGHT: Enhancing learning path recommendation via knowledge topology-aware sequence optimization,</w:t>
       </w:r>
       <w:r>
         <w:rPr>
@@ -22005,28 +21701,55 @@
           <w:lang w:eastAsia="en-US"/>
           <w14:ligatures w14:val="standardContextual"/>
         </w:rPr>
-        <w:t xml:space="preserve"> [Online]. Available: </w:t>
-      </w:r>
-      <w:r>
-        <w:rPr>
-          <w:rStyle w:val="Hyperlink"/>
-          <w:sz w:val="28"/>
-          <w:szCs w:val="28"/>
-          <w:lang w:eastAsia="en-US"/>
-        </w:rPr>
-        <w:t xml:space="preserve">https://mochivia.com/. </w:t>
-      </w:r>
-      <w:r>
-        <w:rPr>
-          <w:rFonts w:ascii="Times New Roman" w:eastAsiaTheme="minorEastAsia" w:hAnsiTheme="minorHAnsi" w:cstheme="minorBidi"/>
-          <w:color w:val="000000"/>
-          <w:kern w:val="2"/>
-          <w:sz w:val="28"/>
-          <w:szCs w:val="28"/>
-          <w:lang w:eastAsia="en-US"/>
-          <w14:ligatures w14:val="standardContextual"/>
-        </w:rPr>
-        <w:t>[Accessed: Oct. 6, 2026].</w:t>
+        <w:t xml:space="preserve"> in Proc. 48th Int. ACM SIGIR Conf. Res. Develop. Inf. Retrieval (SIGIR </w:t>
+      </w:r>
+      <w:r>
+        <w:rPr>
+          <w:rFonts w:ascii="Times New Roman" w:eastAsiaTheme="minorEastAsia" w:hAnsiTheme="minorHAnsi" w:cstheme="minorBidi"/>
+          <w:color w:val="000000"/>
+          <w:kern w:val="2"/>
+          <w:sz w:val="28"/>
+          <w:szCs w:val="28"/>
+          <w:lang w:eastAsia="en-US"/>
+          <w14:ligatures w14:val="standardContextual"/>
+        </w:rPr>
+        <w:t>’</w:t>
+      </w:r>
+      <w:r>
+        <w:rPr>
+          <w:rFonts w:ascii="Times New Roman" w:eastAsiaTheme="minorEastAsia" w:hAnsiTheme="minorHAnsi" w:cstheme="minorBidi"/>
+          <w:color w:val="000000"/>
+          <w:kern w:val="2"/>
+          <w:sz w:val="28"/>
+          <w:szCs w:val="28"/>
+          <w:lang w:eastAsia="en-US"/>
+          <w14:ligatures w14:val="standardContextual"/>
+        </w:rPr>
+        <w:t>25), Padua, Italy, 2025, pp. 306</w:t>
+      </w:r>
+      <w:r>
+        <w:rPr>
+          <w:rFonts w:ascii="Times New Roman" w:eastAsiaTheme="minorEastAsia" w:hAnsiTheme="minorHAnsi" w:cstheme="minorBidi"/>
+          <w:color w:val="000000"/>
+          <w:kern w:val="2"/>
+          <w:sz w:val="28"/>
+          <w:szCs w:val="28"/>
+          <w:lang w:eastAsia="en-US"/>
+          <w14:ligatures w14:val="standardContextual"/>
+        </w:rPr>
+        <w:t>–</w:t>
+      </w:r>
+      <w:r>
+        <w:rPr>
+          <w:rFonts w:ascii="Times New Roman" w:eastAsiaTheme="minorEastAsia" w:hAnsiTheme="minorHAnsi" w:cstheme="minorBidi"/>
+          <w:color w:val="000000"/>
+          <w:kern w:val="2"/>
+          <w:sz w:val="28"/>
+          <w:szCs w:val="28"/>
+          <w:lang w:eastAsia="en-US"/>
+          <w14:ligatures w14:val="standardContextual"/>
+        </w:rPr>
+        <w:t>315, doi: 10.1145/3726302.3730022.</w:t>
       </w:r>
     </w:p>
     <w:p>
@@ -22056,7 +21779,7 @@
           <w:lang w:eastAsia="en-US"/>
           <w14:ligatures w14:val="standardContextual"/>
         </w:rPr>
-        <w:t xml:space="preserve">[20] DevRoadmaps, </w:t>
+        <w:t xml:space="preserve">[17] roadmap.sh, </w:t>
       </w:r>
       <w:r>
         <w:rPr>
@@ -22080,7 +21803,7 @@
           <w:lang w:eastAsia="en-US"/>
           <w14:ligatures w14:val="standardContextual"/>
         </w:rPr>
-        <w:t>Free Developer Roadmaps with 920+ Topics,</w:t>
+        <w:t>Developer Roadmaps,</w:t>
       </w:r>
       <w:r>
         <w:rPr>
@@ -22113,19 +21836,37 @@
           <w:szCs w:val="28"/>
           <w:lang w:eastAsia="en-US"/>
         </w:rPr>
-        <w:t>https://rudra496.github.io/devroadmaps/.</w:t>
-      </w:r>
-      <w:r>
-        <w:rPr>
-          <w:rFonts w:ascii="Times New Roman" w:eastAsiaTheme="minorEastAsia" w:hAnsiTheme="minorHAnsi" w:cstheme="minorBidi"/>
-          <w:color w:val="000000"/>
-          <w:kern w:val="2"/>
-          <w:sz w:val="28"/>
-          <w:szCs w:val="28"/>
-          <w:lang w:eastAsia="en-US"/>
-          <w14:ligatures w14:val="standardContextual"/>
-        </w:rPr>
-        <w:t xml:space="preserve"> [Accessed: Oct. 6, 2026].</w:t>
+        <w:t>https://roadmap.sh/</w:t>
+      </w:r>
+      <w:r>
+        <w:rPr>
+          <w:rStyle w:val="Hyperlink"/>
+          <w:sz w:val="28"/>
+          <w:szCs w:val="28"/>
+          <w:lang w:eastAsia="en-US"/>
+        </w:rPr>
+        <w:t>.</w:t>
+      </w:r>
+      <w:r>
+        <w:rPr>
+          <w:rStyle w:val="Hyperlink"/>
+          <w:sz w:val="28"/>
+          <w:szCs w:val="28"/>
+          <w:lang w:eastAsia="en-US"/>
+        </w:rPr>
+        <w:t xml:space="preserve"> </w:t>
+      </w:r>
+      <w:r>
+        <w:rPr>
+          <w:rFonts w:ascii="Times New Roman" w:eastAsiaTheme="minorEastAsia" w:hAnsiTheme="minorHAnsi" w:cstheme="minorBidi"/>
+          <w:color w:val="000000"/>
+          <w:kern w:val="2"/>
+          <w:sz w:val="28"/>
+          <w:szCs w:val="28"/>
+          <w:lang w:eastAsia="en-US"/>
+          <w14:ligatures w14:val="standardContextual"/>
+        </w:rPr>
+        <w:t>[Accessed: Oct. 6, 2026].</w:t>
       </w:r>
     </w:p>
     <w:p>
@@ -22155,7 +21896,7 @@
           <w:lang w:eastAsia="en-US"/>
           <w14:ligatures w14:val="standardContextual"/>
         </w:rPr>
-        <w:t xml:space="preserve">[21] Developer Paths, </w:t>
+        <w:t xml:space="preserve">[18] Learn Anything, </w:t>
       </w:r>
       <w:r>
         <w:rPr>
@@ -22179,7 +21920,7 @@
           <w:lang w:eastAsia="en-US"/>
           <w14:ligatures w14:val="standardContextual"/>
         </w:rPr>
-        <w:t>The Ultimate Developer Roadmap &amp; Quiz Platform,</w:t>
+        <w:t>Learn Anything,</w:t>
       </w:r>
       <w:r>
         <w:rPr>
@@ -22212,7 +21953,7 @@
           <w:szCs w:val="28"/>
           <w:lang w:eastAsia="en-US"/>
         </w:rPr>
-        <w:t>https://developerpaths.dev/.</w:t>
+        <w:t>https://learn-anything.xyz/.</w:t>
       </w:r>
       <w:r>
         <w:rPr>
@@ -22254,6 +21995,304 @@
           <w:lang w:eastAsia="en-US"/>
           <w14:ligatures w14:val="standardContextual"/>
         </w:rPr>
+        <w:t xml:space="preserve">[19] Mochivia, </w:t>
+      </w:r>
+      <w:r>
+        <w:rPr>
+          <w:rFonts w:ascii="Times New Roman" w:eastAsiaTheme="minorEastAsia" w:hAnsiTheme="minorHAnsi" w:cstheme="minorBidi"/>
+          <w:color w:val="000000"/>
+          <w:kern w:val="2"/>
+          <w:sz w:val="28"/>
+          <w:szCs w:val="28"/>
+          <w:lang w:eastAsia="en-US"/>
+          <w14:ligatures w14:val="standardContextual"/>
+        </w:rPr>
+        <w:t>“</w:t>
+      </w:r>
+      <w:r>
+        <w:rPr>
+          <w:rFonts w:ascii="Times New Roman" w:eastAsiaTheme="minorEastAsia" w:hAnsiTheme="minorHAnsi" w:cstheme="minorBidi"/>
+          <w:color w:val="000000"/>
+          <w:kern w:val="2"/>
+          <w:sz w:val="28"/>
+          <w:szCs w:val="28"/>
+          <w:lang w:eastAsia="en-US"/>
+          <w14:ligatures w14:val="standardContextual"/>
+        </w:rPr>
+        <w:t>Learn Anything, Actually Follow Through,</w:t>
+      </w:r>
+      <w:r>
+        <w:rPr>
+          <w:rFonts w:ascii="Times New Roman" w:eastAsiaTheme="minorEastAsia" w:hAnsiTheme="minorHAnsi" w:cstheme="minorBidi"/>
+          <w:color w:val="000000"/>
+          <w:kern w:val="2"/>
+          <w:sz w:val="28"/>
+          <w:szCs w:val="28"/>
+          <w:lang w:eastAsia="en-US"/>
+          <w14:ligatures w14:val="standardContextual"/>
+        </w:rPr>
+        <w:t>”</w:t>
+      </w:r>
+      <w:r>
+        <w:rPr>
+          <w:rFonts w:ascii="Times New Roman" w:eastAsiaTheme="minorEastAsia" w:hAnsiTheme="minorHAnsi" w:cstheme="minorBidi"/>
+          <w:color w:val="000000"/>
+          <w:kern w:val="2"/>
+          <w:sz w:val="28"/>
+          <w:szCs w:val="28"/>
+          <w:lang w:eastAsia="en-US"/>
+          <w14:ligatures w14:val="standardContextual"/>
+        </w:rPr>
+        <w:t xml:space="preserve"> [Online]. Available: </w:t>
+      </w:r>
+      <w:r>
+        <w:rPr>
+          <w:rStyle w:val="Hyperlink"/>
+          <w:sz w:val="28"/>
+          <w:szCs w:val="28"/>
+          <w:lang w:eastAsia="en-US"/>
+        </w:rPr>
+        <w:t xml:space="preserve">https://mochivia.com/. </w:t>
+      </w:r>
+      <w:r>
+        <w:rPr>
+          <w:rFonts w:ascii="Times New Roman" w:eastAsiaTheme="minorEastAsia" w:hAnsiTheme="minorHAnsi" w:cstheme="minorBidi"/>
+          <w:color w:val="000000"/>
+          <w:kern w:val="2"/>
+          <w:sz w:val="28"/>
+          <w:szCs w:val="28"/>
+          <w:lang w:eastAsia="en-US"/>
+          <w14:ligatures w14:val="standardContextual"/>
+        </w:rPr>
+        <w:t>[Accessed: Oct. 6, 2026].</w:t>
+      </w:r>
+    </w:p>
+    <w:p>
+      <w:pPr>
+        <w:widowControl w:val="0"/>
+        <w:autoSpaceDE w:val="0"/>
+        <w:autoSpaceDN w:val="0"/>
+        <w:spacing w:before="171" w:line="311" w:lineRule="exact"/>
+        <w:jc w:val="both"/>
+        <w:rPr>
+          <w:rFonts w:ascii="Times New Roman" w:eastAsiaTheme="minorEastAsia" w:hAnsiTheme="minorHAnsi" w:cstheme="minorBidi"/>
+          <w:color w:val="000000"/>
+          <w:kern w:val="2"/>
+          <w:sz w:val="28"/>
+          <w:szCs w:val="28"/>
+          <w:lang w:eastAsia="en-US"/>
+          <w14:ligatures w14:val="standardContextual"/>
+        </w:rPr>
+      </w:pPr>
+      <w:r>
+        <w:rPr>
+          <w:rFonts w:ascii="Times New Roman" w:eastAsiaTheme="minorEastAsia" w:hAnsiTheme="minorHAnsi" w:cstheme="minorBidi"/>
+          <w:color w:val="000000"/>
+          <w:kern w:val="2"/>
+          <w:sz w:val="28"/>
+          <w:szCs w:val="28"/>
+          <w:lang w:eastAsia="en-US"/>
+          <w14:ligatures w14:val="standardContextual"/>
+        </w:rPr>
+        <w:t xml:space="preserve">[20] DevRoadmaps, </w:t>
+      </w:r>
+      <w:r>
+        <w:rPr>
+          <w:rFonts w:ascii="Times New Roman" w:eastAsiaTheme="minorEastAsia" w:hAnsiTheme="minorHAnsi" w:cstheme="minorBidi"/>
+          <w:color w:val="000000"/>
+          <w:kern w:val="2"/>
+          <w:sz w:val="28"/>
+          <w:szCs w:val="28"/>
+          <w:lang w:eastAsia="en-US"/>
+          <w14:ligatures w14:val="standardContextual"/>
+        </w:rPr>
+        <w:t>“</w:t>
+      </w:r>
+      <w:r>
+        <w:rPr>
+          <w:rFonts w:ascii="Times New Roman" w:eastAsiaTheme="minorEastAsia" w:hAnsiTheme="minorHAnsi" w:cstheme="minorBidi"/>
+          <w:color w:val="000000"/>
+          <w:kern w:val="2"/>
+          <w:sz w:val="28"/>
+          <w:szCs w:val="28"/>
+          <w:lang w:eastAsia="en-US"/>
+          <w14:ligatures w14:val="standardContextual"/>
+        </w:rPr>
+        <w:t>Free Developer Roadmaps with 920+ Topics,</w:t>
+      </w:r>
+      <w:r>
+        <w:rPr>
+          <w:rFonts w:ascii="Times New Roman" w:eastAsiaTheme="minorEastAsia" w:hAnsiTheme="minorHAnsi" w:cstheme="minorBidi"/>
+          <w:color w:val="000000"/>
+          <w:kern w:val="2"/>
+          <w:sz w:val="28"/>
+          <w:szCs w:val="28"/>
+          <w:lang w:eastAsia="en-US"/>
+          <w14:ligatures w14:val="standardContextual"/>
+        </w:rPr>
+        <w:t>”</w:t>
+      </w:r>
+      <w:r>
+        <w:rPr>
+          <w:rFonts w:ascii="Times New Roman" w:eastAsiaTheme="minorEastAsia" w:hAnsiTheme="minorHAnsi" w:cstheme="minorBidi"/>
+          <w:color w:val="000000"/>
+          <w:kern w:val="2"/>
+          <w:sz w:val="28"/>
+          <w:szCs w:val="28"/>
+          <w:lang w:eastAsia="en-US"/>
+          <w14:ligatures w14:val="standardContextual"/>
+        </w:rPr>
+        <w:t xml:space="preserve"> [Online]. Available: </w:t>
+      </w:r>
+      <w:r>
+        <w:rPr>
+          <w:rStyle w:val="Hyperlink"/>
+          <w:sz w:val="28"/>
+          <w:szCs w:val="28"/>
+          <w:lang w:eastAsia="en-US"/>
+        </w:rPr>
+        <w:t>https://rudra496.github.io/devroadmaps/.</w:t>
+      </w:r>
+      <w:r>
+        <w:rPr>
+          <w:rFonts w:ascii="Times New Roman" w:eastAsiaTheme="minorEastAsia" w:hAnsiTheme="minorHAnsi" w:cstheme="minorBidi"/>
+          <w:color w:val="000000"/>
+          <w:kern w:val="2"/>
+          <w:sz w:val="28"/>
+          <w:szCs w:val="28"/>
+          <w:lang w:eastAsia="en-US"/>
+          <w14:ligatures w14:val="standardContextual"/>
+        </w:rPr>
+        <w:t xml:space="preserve"> [Accessed: Oct. 6, 2026].</w:t>
+      </w:r>
+    </w:p>
+    <w:p>
+      <w:pPr>
+        <w:widowControl w:val="0"/>
+        <w:autoSpaceDE w:val="0"/>
+        <w:autoSpaceDN w:val="0"/>
+        <w:spacing w:before="171" w:line="311" w:lineRule="exact"/>
+        <w:jc w:val="both"/>
+        <w:rPr>
+          <w:rFonts w:ascii="Times New Roman" w:eastAsiaTheme="minorEastAsia" w:hAnsiTheme="minorHAnsi" w:cstheme="minorBidi"/>
+          <w:color w:val="000000"/>
+          <w:kern w:val="2"/>
+          <w:sz w:val="28"/>
+          <w:szCs w:val="28"/>
+          <w:lang w:eastAsia="en-US"/>
+          <w14:ligatures w14:val="standardContextual"/>
+        </w:rPr>
+      </w:pPr>
+      <w:r>
+        <w:rPr>
+          <w:rFonts w:ascii="Times New Roman" w:eastAsiaTheme="minorEastAsia" w:hAnsiTheme="minorHAnsi" w:cstheme="minorBidi"/>
+          <w:color w:val="000000"/>
+          <w:kern w:val="2"/>
+          <w:sz w:val="28"/>
+          <w:szCs w:val="28"/>
+          <w:lang w:eastAsia="en-US"/>
+          <w14:ligatures w14:val="standardContextual"/>
+        </w:rPr>
+        <w:t xml:space="preserve">[21] Developer Paths, </w:t>
+      </w:r>
+      <w:r>
+        <w:rPr>
+          <w:rFonts w:ascii="Times New Roman" w:eastAsiaTheme="minorEastAsia" w:hAnsiTheme="minorHAnsi" w:cstheme="minorBidi"/>
+          <w:color w:val="000000"/>
+          <w:kern w:val="2"/>
+          <w:sz w:val="28"/>
+          <w:szCs w:val="28"/>
+          <w:lang w:eastAsia="en-US"/>
+          <w14:ligatures w14:val="standardContextual"/>
+        </w:rPr>
+        <w:t>“</w:t>
+      </w:r>
+      <w:r>
+        <w:rPr>
+          <w:rFonts w:ascii="Times New Roman" w:eastAsiaTheme="minorEastAsia" w:hAnsiTheme="minorHAnsi" w:cstheme="minorBidi"/>
+          <w:color w:val="000000"/>
+          <w:kern w:val="2"/>
+          <w:sz w:val="28"/>
+          <w:szCs w:val="28"/>
+          <w:lang w:eastAsia="en-US"/>
+          <w14:ligatures w14:val="standardContextual"/>
+        </w:rPr>
+        <w:t>The Ultimate Developer Roadmap &amp; Quiz Platform,</w:t>
+      </w:r>
+      <w:r>
+        <w:rPr>
+          <w:rFonts w:ascii="Times New Roman" w:eastAsiaTheme="minorEastAsia" w:hAnsiTheme="minorHAnsi" w:cstheme="minorBidi"/>
+          <w:color w:val="000000"/>
+          <w:kern w:val="2"/>
+          <w:sz w:val="28"/>
+          <w:szCs w:val="28"/>
+          <w:lang w:eastAsia="en-US"/>
+          <w14:ligatures w14:val="standardContextual"/>
+        </w:rPr>
+        <w:t>”</w:t>
+      </w:r>
+      <w:r>
+        <w:rPr>
+          <w:rFonts w:ascii="Times New Roman" w:eastAsiaTheme="minorEastAsia" w:hAnsiTheme="minorHAnsi" w:cstheme="minorBidi"/>
+          <w:color w:val="000000"/>
+          <w:kern w:val="2"/>
+          <w:sz w:val="28"/>
+          <w:szCs w:val="28"/>
+          <w:lang w:eastAsia="en-US"/>
+          <w14:ligatures w14:val="standardContextual"/>
+        </w:rPr>
+        <w:t xml:space="preserve"> [Online]. Available: </w:t>
+      </w:r>
+      <w:r>
+        <w:rPr>
+          <w:rStyle w:val="Hyperlink"/>
+          <w:sz w:val="28"/>
+          <w:szCs w:val="28"/>
+          <w:lang w:eastAsia="en-US"/>
+        </w:rPr>
+        <w:t>https://developerpaths.dev/.</w:t>
+      </w:r>
+      <w:r>
+        <w:rPr>
+          <w:rFonts w:ascii="Times New Roman" w:eastAsiaTheme="minorEastAsia" w:hAnsiTheme="minorHAnsi" w:cstheme="minorBidi"/>
+          <w:color w:val="000000"/>
+          <w:kern w:val="2"/>
+          <w:sz w:val="28"/>
+          <w:szCs w:val="28"/>
+          <w:lang w:eastAsia="en-US"/>
+          <w14:ligatures w14:val="standardContextual"/>
+        </w:rPr>
+        <w:t xml:space="preserve"> [Accessed: Oct. 6, 2026].</w:t>
+      </w:r>
+    </w:p>
+    <w:p>
+      <w:pPr>
+        <w:widowControl w:val="0"/>
+        <w:autoSpaceDE w:val="0"/>
+        <w:autoSpaceDN w:val="0"/>
+        <w:spacing w:before="171" w:line="311" w:lineRule="exact"/>
+        <w:jc w:val="both"/>
+        <w:rPr>
+          <w:rFonts w:ascii="Times New Roman" w:eastAsiaTheme="minorEastAsia" w:hAnsiTheme="minorHAnsi" w:cstheme="minorBidi"/>
+          <w:color w:val="000000"/>
+          <w:kern w:val="2"/>
+          <w:sz w:val="28"/>
+          <w:szCs w:val="28"/>
+          <w:lang w:eastAsia="en-US"/>
+          <w14:ligatures w14:val="standardContextual"/>
+        </w:rPr>
+      </w:pPr>
+      <w:r>
+        <w:rPr>
+          <w:rFonts w:ascii="Times New Roman" w:eastAsiaTheme="minorEastAsia" w:hAnsiTheme="minorHAnsi" w:cstheme="minorBidi"/>
+          <w:color w:val="000000"/>
+          <w:kern w:val="2"/>
+          <w:sz w:val="28"/>
+          <w:szCs w:val="28"/>
+          <w:lang w:eastAsia="en-US"/>
+          <w14:ligatures w14:val="standardContextual"/>
+        </w:rPr>
+        <w:lastRenderedPageBreak/>
         <w:t xml:space="preserve">[22] roadmap.sh, </w:t>
       </w:r>
       <w:r>
@@ -28034,6 +28073,7 @@
   <w:style w:type="character" w:default="1" w:styleId="DefaultParagraphFont">
     <w:name w:val="Default Paragraph Font"/>
     <w:uiPriority w:val="1"/>
+    <w:semiHidden/>
     <w:unhideWhenUsed/>
   </w:style>
   <w:style w:type="table" w:default="1" w:styleId="TableNormal">

</xml_diff>